<commit_message>
Added C# basics document in Iteration 1
</commit_message>
<xml_diff>
--- a/developer/dipesh-s394745/Iteration_1/C#Basis.docx
+++ b/developer/dipesh-s394745/Iteration_1/C#Basis.docx
@@ -31,27 +31,7 @@
           <w:sz w:val="32"/>
           <w:szCs w:val="32"/>
         </w:rPr>
-        <w:t>c</w:t>
-      </w:r>
-      <w:r>
-        <w:rPr>
-          <w:rFonts w:ascii="Times New Roman" w:hAnsi="Times New Roman" w:cs="Times New Roman"/>
-          <w:b/>
-          <w:bCs/>
-          <w:sz w:val="32"/>
-          <w:szCs w:val="32"/>
-        </w:rPr>
-        <w:t>s</w:t>
-      </w:r>
-      <w:r>
-        <w:rPr>
-          <w:rFonts w:ascii="Times New Roman" w:hAnsi="Times New Roman" w:cs="Times New Roman"/>
-          <w:b/>
-          <w:bCs/>
-          <w:sz w:val="32"/>
-          <w:szCs w:val="32"/>
-        </w:rPr>
-        <w:t>:</w:t>
+        <w:t>cs:</w:t>
       </w:r>
     </w:p>
     <w:p>
@@ -62,23 +42,17 @@
           <w:numId w:val="2"/>
         </w:numPr>
         <w:rPr>
-          <w:lang w:val="en-US"/>
-        </w:rPr>
-      </w:pPr>
-      <w:r>
-        <w:rPr>
-          <w:lang w:val="en-US"/>
-        </w:rPr>
-        <w:t xml:space="preserve">Program </w:t>
-      </w:r>
-      <w:proofErr w:type="spellStart"/>
-      <w:r>
-        <w:rPr>
-          <w:lang w:val="en-US"/>
-        </w:rPr>
-        <w:t>Struture</w:t>
-      </w:r>
-      <w:proofErr w:type="spellEnd"/>
+          <w:rFonts w:ascii="Times New Roman" w:hAnsi="Times New Roman" w:cs="Times New Roman"/>
+          <w:lang w:val="en-US"/>
+        </w:rPr>
+      </w:pPr>
+      <w:r>
+        <w:rPr>
+          <w:rFonts w:ascii="Times New Roman" w:hAnsi="Times New Roman" w:cs="Times New Roman"/>
+          <w:lang w:val="en-US"/>
+        </w:rPr>
+        <w:t>Program Struture</w:t>
+      </w:r>
     </w:p>
     <w:p>
       <w:pPr>
@@ -88,11 +62,15 @@
           <w:numId w:val="3"/>
         </w:numPr>
         <w:rPr>
-          <w:lang w:val="en-US"/>
-        </w:rPr>
-      </w:pPr>
-      <w:r>
-        <w:rPr>
+          <w:rFonts w:ascii="Times New Roman" w:hAnsi="Times New Roman" w:cs="Times New Roman"/>
+          <w:b/>
+          <w:bCs/>
+          <w:lang w:val="en-US"/>
+        </w:rPr>
+      </w:pPr>
+      <w:r>
+        <w:rPr>
+          <w:rFonts w:ascii="Times New Roman" w:hAnsi="Times New Roman" w:cs="Times New Roman"/>
           <w:b/>
           <w:bCs/>
           <w:lang w:val="en-US"/>
@@ -101,9 +79,9 @@
       </w:r>
       <w:r>
         <w:rPr>
-          <w:lang w:val="en-US"/>
-        </w:rPr>
-        <w:t>A container used to organize related classes and avoid naming conflicts.</w:t>
+          <w:rFonts w:ascii="Times New Roman" w:hAnsi="Times New Roman" w:cs="Times New Roman"/>
+        </w:rPr>
+        <w:t>A container to group related classes and prevent naming conflicts.</w:t>
       </w:r>
     </w:p>
     <w:p>
@@ -114,13 +92,15 @@
           <w:numId w:val="3"/>
         </w:numPr>
         <w:rPr>
-          <w:b/>
-          <w:bCs/>
-          <w:lang w:val="en-US"/>
-        </w:rPr>
-      </w:pPr>
-      <w:r>
-        <w:rPr>
+          <w:rFonts w:ascii="Times New Roman" w:hAnsi="Times New Roman" w:cs="Times New Roman"/>
+          <w:b/>
+          <w:bCs/>
+          <w:lang w:val="en-US"/>
+        </w:rPr>
+      </w:pPr>
+      <w:r>
+        <w:rPr>
+          <w:rFonts w:ascii="Times New Roman" w:hAnsi="Times New Roman" w:cs="Times New Roman"/>
           <w:b/>
           <w:bCs/>
           <w:lang w:val="en-US"/>
@@ -129,9 +109,9 @@
       </w:r>
       <w:r>
         <w:rPr>
-          <w:lang w:val="en-US"/>
-        </w:rPr>
-        <w:t>A blueprint for creating objects; it groups data (fields) and behavior (methods) together.</w:t>
+          <w:rFonts w:ascii="Times New Roman" w:hAnsi="Times New Roman" w:cs="Times New Roman"/>
+        </w:rPr>
+        <w:t>A blueprint for creating objects, a collection of data (fields) and behavior (methods).</w:t>
       </w:r>
     </w:p>
     <w:p>
@@ -142,11 +122,13 @@
           <w:numId w:val="3"/>
         </w:numPr>
         <w:rPr>
-          <w:lang w:val="en-US"/>
-        </w:rPr>
-      </w:pPr>
-      <w:r>
-        <w:rPr>
+          <w:rFonts w:ascii="Times New Roman" w:hAnsi="Times New Roman" w:cs="Times New Roman"/>
+          <w:lang w:val="en-US"/>
+        </w:rPr>
+      </w:pPr>
+      <w:r>
+        <w:rPr>
+          <w:rFonts w:ascii="Times New Roman" w:hAnsi="Times New Roman" w:cs="Times New Roman"/>
           <w:b/>
           <w:bCs/>
           <w:lang w:val="en-US"/>
@@ -155,9 +137,9 @@
       </w:r>
       <w:r>
         <w:rPr>
-          <w:lang w:val="en-US"/>
-        </w:rPr>
-        <w:t>The entry point of a C# program; execution always starts here (static void Main).</w:t>
+          <w:rFonts w:ascii="Times New Roman" w:hAnsi="Times New Roman" w:cs="Times New Roman"/>
+        </w:rPr>
+        <w:t>A method that always runs when the C# program starts up (static void Main).</w:t>
       </w:r>
     </w:p>
     <w:p>
@@ -168,11 +150,13 @@
           <w:numId w:val="3"/>
         </w:numPr>
         <w:rPr>
-          <w:lang w:val="en-US"/>
-        </w:rPr>
-      </w:pPr>
-      <w:r>
-        <w:rPr>
+          <w:rFonts w:ascii="Times New Roman" w:hAnsi="Times New Roman" w:cs="Times New Roman"/>
+          <w:lang w:val="en-US"/>
+        </w:rPr>
+      </w:pPr>
+      <w:r>
+        <w:rPr>
+          <w:rFonts w:ascii="Times New Roman" w:hAnsi="Times New Roman" w:cs="Times New Roman"/>
           <w:b/>
           <w:bCs/>
           <w:lang w:val="en-US"/>
@@ -181,6 +165,7 @@
       </w:r>
       <w:r>
         <w:rPr>
+          <w:rFonts w:ascii="Times New Roman" w:hAnsi="Times New Roman" w:cs="Times New Roman"/>
           <w:lang w:val="en-US"/>
         </w:rPr>
         <w:t>Lets you use classes from a namespace without typing the full name every time.</w:t>
@@ -194,11 +179,13 @@
           <w:numId w:val="2"/>
         </w:numPr>
         <w:rPr>
-          <w:lang w:val="en-US"/>
-        </w:rPr>
-      </w:pPr>
-      <w:r>
-        <w:rPr>
+          <w:rFonts w:ascii="Times New Roman" w:hAnsi="Times New Roman" w:cs="Times New Roman"/>
+          <w:lang w:val="en-US"/>
+        </w:rPr>
+      </w:pPr>
+      <w:r>
+        <w:rPr>
+          <w:rFonts w:ascii="Times New Roman" w:hAnsi="Times New Roman" w:cs="Times New Roman"/>
           <w:lang w:val="en-US"/>
         </w:rPr>
         <w:t>Variables and Data Types</w:t>
@@ -212,11 +199,13 @@
           <w:numId w:val="5"/>
         </w:numPr>
         <w:rPr>
-          <w:lang w:val="en-US"/>
-        </w:rPr>
-      </w:pPr>
-      <w:r>
-        <w:rPr>
+          <w:rFonts w:ascii="Times New Roman" w:hAnsi="Times New Roman" w:cs="Times New Roman"/>
+          <w:lang w:val="en-US"/>
+        </w:rPr>
+      </w:pPr>
+      <w:r>
+        <w:rPr>
+          <w:rFonts w:ascii="Times New Roman" w:hAnsi="Times New Roman" w:cs="Times New Roman"/>
           <w:b/>
           <w:bCs/>
           <w:lang w:val="en-US"/>
@@ -225,6 +214,7 @@
       </w:r>
       <w:r>
         <w:rPr>
+          <w:rFonts w:ascii="Times New Roman" w:hAnsi="Times New Roman" w:cs="Times New Roman"/>
           <w:lang w:val="en-US"/>
         </w:rPr>
         <w:t xml:space="preserve"> A named storage location that holds a value which can change during program execution.</w:t>
@@ -238,11 +228,13 @@
           <w:numId w:val="4"/>
         </w:numPr>
         <w:rPr>
-          <w:lang w:val="en-US"/>
-        </w:rPr>
-      </w:pPr>
-      <w:r>
-        <w:rPr>
+          <w:rFonts w:ascii="Times New Roman" w:hAnsi="Times New Roman" w:cs="Times New Roman"/>
+          <w:lang w:val="en-US"/>
+        </w:rPr>
+      </w:pPr>
+      <w:r>
+        <w:rPr>
+          <w:rFonts w:ascii="Times New Roman" w:hAnsi="Times New Roman" w:cs="Times New Roman"/>
           <w:b/>
           <w:bCs/>
           <w:lang w:val="en-US"/>
@@ -251,9 +243,16 @@
       </w:r>
       <w:r>
         <w:rPr>
-          <w:lang w:val="en-US"/>
-        </w:rPr>
-        <w:t xml:space="preserve"> Stores whole numbers, like 5 or -100.</w:t>
+          <w:rFonts w:ascii="Times New Roman" w:hAnsi="Times New Roman" w:cs="Times New Roman"/>
+          <w:lang w:val="en-US"/>
+        </w:rPr>
+        <w:t xml:space="preserve"> </w:t>
+      </w:r>
+      <w:r>
+        <w:rPr>
+          <w:rFonts w:ascii="Times New Roman" w:hAnsi="Times New Roman" w:cs="Times New Roman"/>
+        </w:rPr>
+        <w:t>Holds integers (whole numbers): 5 or -100.</w:t>
       </w:r>
     </w:p>
     <w:p>
@@ -264,11 +263,13 @@
           <w:numId w:val="4"/>
         </w:numPr>
         <w:rPr>
-          <w:lang w:val="en-US"/>
-        </w:rPr>
-      </w:pPr>
-      <w:r>
-        <w:rPr>
+          <w:rFonts w:ascii="Times New Roman" w:hAnsi="Times New Roman" w:cs="Times New Roman"/>
+          <w:lang w:val="en-US"/>
+        </w:rPr>
+      </w:pPr>
+      <w:r>
+        <w:rPr>
+          <w:rFonts w:ascii="Times New Roman" w:hAnsi="Times New Roman" w:cs="Times New Roman"/>
           <w:b/>
           <w:bCs/>
           <w:lang w:val="en-US"/>
@@ -277,9 +278,16 @@
       </w:r>
       <w:r>
         <w:rPr>
-          <w:lang w:val="en-US"/>
-        </w:rPr>
-        <w:t xml:space="preserve"> Stores decimal (floating-point) numbers, like 3.14.</w:t>
+          <w:rFonts w:ascii="Times New Roman" w:hAnsi="Times New Roman" w:cs="Times New Roman"/>
+          <w:lang w:val="en-US"/>
+        </w:rPr>
+        <w:t xml:space="preserve"> </w:t>
+      </w:r>
+      <w:r>
+        <w:rPr>
+          <w:rFonts w:ascii="Times New Roman" w:hAnsi="Times New Roman" w:cs="Times New Roman"/>
+        </w:rPr>
+        <w:t>Decimal (floating-point) numbers, such as 3.14.</w:t>
       </w:r>
     </w:p>
     <w:p>
@@ -290,11 +298,13 @@
           <w:numId w:val="4"/>
         </w:numPr>
         <w:rPr>
-          <w:lang w:val="en-US"/>
-        </w:rPr>
-      </w:pPr>
-      <w:r>
-        <w:rPr>
+          <w:rFonts w:ascii="Times New Roman" w:hAnsi="Times New Roman" w:cs="Times New Roman"/>
+          <w:lang w:val="en-US"/>
+        </w:rPr>
+      </w:pPr>
+      <w:r>
+        <w:rPr>
+          <w:rFonts w:ascii="Times New Roman" w:hAnsi="Times New Roman" w:cs="Times New Roman"/>
           <w:b/>
           <w:bCs/>
           <w:lang w:val="en-US"/>
@@ -303,9 +313,16 @@
       </w:r>
       <w:r>
         <w:rPr>
-          <w:lang w:val="en-US"/>
-        </w:rPr>
-        <w:t xml:space="preserve"> Stores text, written inside double quotes, e.g. "Hello".</w:t>
+          <w:rFonts w:ascii="Times New Roman" w:hAnsi="Times New Roman" w:cs="Times New Roman"/>
+          <w:lang w:val="en-US"/>
+        </w:rPr>
+        <w:t xml:space="preserve"> </w:t>
+      </w:r>
+      <w:r>
+        <w:rPr>
+          <w:rFonts w:ascii="Times New Roman" w:hAnsi="Times New Roman" w:cs="Times New Roman"/>
+        </w:rPr>
+        <w:t>Text (written in double quotes), such as "Hello".</w:t>
       </w:r>
     </w:p>
     <w:p>
@@ -316,11 +333,13 @@
           <w:numId w:val="4"/>
         </w:numPr>
         <w:rPr>
-          <w:lang w:val="en-US"/>
-        </w:rPr>
-      </w:pPr>
-      <w:r>
-        <w:rPr>
+          <w:rFonts w:ascii="Times New Roman" w:hAnsi="Times New Roman" w:cs="Times New Roman"/>
+          <w:lang w:val="en-US"/>
+        </w:rPr>
+      </w:pPr>
+      <w:r>
+        <w:rPr>
+          <w:rFonts w:ascii="Times New Roman" w:hAnsi="Times New Roman" w:cs="Times New Roman"/>
           <w:b/>
           <w:bCs/>
           <w:lang w:val="en-US"/>
@@ -329,9 +348,16 @@
       </w:r>
       <w:r>
         <w:rPr>
-          <w:lang w:val="en-US"/>
-        </w:rPr>
-        <w:t xml:space="preserve"> Stores only two values: true or false.</w:t>
+          <w:rFonts w:ascii="Times New Roman" w:hAnsi="Times New Roman" w:cs="Times New Roman"/>
+          <w:lang w:val="en-US"/>
+        </w:rPr>
+        <w:t xml:space="preserve"> </w:t>
+      </w:r>
+      <w:r>
+        <w:rPr>
+          <w:rFonts w:ascii="Times New Roman" w:hAnsi="Times New Roman" w:cs="Times New Roman"/>
+        </w:rPr>
+        <w:t>Only holds two values – true or false.</w:t>
       </w:r>
     </w:p>
     <w:p>
@@ -342,29 +368,22 @@
           <w:numId w:val="4"/>
         </w:numPr>
         <w:rPr>
-          <w:lang w:val="en-US"/>
-        </w:rPr>
-      </w:pPr>
-      <w:proofErr w:type="spellStart"/>
-      <w:r>
-        <w:rPr>
-          <w:b/>
-          <w:bCs/>
-          <w:lang w:val="en-US"/>
-        </w:rPr>
-        <w:t>char</w:t>
-      </w:r>
-      <w:proofErr w:type="spellEnd"/>
-      <w:r>
-        <w:rPr>
-          <w:b/>
-          <w:bCs/>
-          <w:lang w:val="en-US"/>
-        </w:rPr>
-        <w:t>:</w:t>
-      </w:r>
-      <w:r>
-        <w:rPr>
+          <w:rFonts w:ascii="Times New Roman" w:hAnsi="Times New Roman" w:cs="Times New Roman"/>
+          <w:lang w:val="en-US"/>
+        </w:rPr>
+      </w:pPr>
+      <w:r>
+        <w:rPr>
+          <w:rFonts w:ascii="Times New Roman" w:hAnsi="Times New Roman" w:cs="Times New Roman"/>
+          <w:b/>
+          <w:bCs/>
+          <w:lang w:val="en-US"/>
+        </w:rPr>
+        <w:t>char:</w:t>
+      </w:r>
+      <w:r>
+        <w:rPr>
+          <w:rFonts w:ascii="Times New Roman" w:hAnsi="Times New Roman" w:cs="Times New Roman"/>
           <w:lang w:val="en-US"/>
         </w:rPr>
         <w:t xml:space="preserve"> Stores a single character, e.g. 'A'.</w:t>
@@ -378,11 +397,13 @@
           <w:numId w:val="4"/>
         </w:numPr>
         <w:rPr>
-          <w:lang w:val="en-US"/>
-        </w:rPr>
-      </w:pPr>
-      <w:r>
-        <w:rPr>
+          <w:rFonts w:ascii="Times New Roman" w:hAnsi="Times New Roman" w:cs="Times New Roman"/>
+          <w:lang w:val="en-US"/>
+        </w:rPr>
+      </w:pPr>
+      <w:r>
+        <w:rPr>
+          <w:rFonts w:ascii="Times New Roman" w:hAnsi="Times New Roman" w:cs="Times New Roman"/>
           <w:b/>
           <w:bCs/>
           <w:lang w:val="en-US"/>
@@ -391,6 +412,7 @@
       </w:r>
       <w:r>
         <w:rPr>
+          <w:rFonts w:ascii="Times New Roman" w:hAnsi="Times New Roman" w:cs="Times New Roman"/>
           <w:lang w:val="en-US"/>
         </w:rPr>
         <w:t xml:space="preserve"> Lets the compiler automatically figure out the data type from the assigned value.</w:t>
@@ -404,11 +426,13 @@
           <w:numId w:val="4"/>
         </w:numPr>
         <w:rPr>
-          <w:lang w:val="en-US"/>
-        </w:rPr>
-      </w:pPr>
-      <w:r>
-        <w:rPr>
+          <w:rFonts w:ascii="Times New Roman" w:hAnsi="Times New Roman" w:cs="Times New Roman"/>
+          <w:lang w:val="en-US"/>
+        </w:rPr>
+      </w:pPr>
+      <w:r>
+        <w:rPr>
+          <w:rFonts w:ascii="Times New Roman" w:hAnsi="Times New Roman" w:cs="Times New Roman"/>
           <w:b/>
           <w:bCs/>
           <w:lang w:val="en-US"/>
@@ -417,6 +441,7 @@
       </w:r>
       <w:r>
         <w:rPr>
+          <w:rFonts w:ascii="Times New Roman" w:hAnsi="Times New Roman" w:cs="Times New Roman"/>
           <w:lang w:val="en-US"/>
         </w:rPr>
         <w:t xml:space="preserve"> A value that is set once and can never be changed afterward.</w:t>
@@ -426,6 +451,7 @@
       <w:pPr>
         <w:pStyle w:val="ListParagraph"/>
         <w:rPr>
+          <w:rFonts w:ascii="Times New Roman" w:hAnsi="Times New Roman" w:cs="Times New Roman"/>
           <w:b/>
           <w:bCs/>
           <w:lang w:val="en-US"/>
@@ -440,11 +466,13 @@
           <w:numId w:val="2"/>
         </w:numPr>
         <w:rPr>
-          <w:lang w:val="en-US"/>
-        </w:rPr>
-      </w:pPr>
-      <w:r>
-        <w:rPr>
+          <w:rFonts w:ascii="Times New Roman" w:hAnsi="Times New Roman" w:cs="Times New Roman"/>
+          <w:lang w:val="en-US"/>
+        </w:rPr>
+      </w:pPr>
+      <w:r>
+        <w:rPr>
+          <w:rFonts w:ascii="Times New Roman" w:hAnsi="Times New Roman" w:cs="Times New Roman"/>
           <w:lang w:val="en-US"/>
         </w:rPr>
         <w:t>Operators</w:t>
@@ -458,11 +486,13 @@
           <w:numId w:val="6"/>
         </w:numPr>
         <w:rPr>
-          <w:lang w:val="en-US"/>
-        </w:rPr>
-      </w:pPr>
-      <w:r>
-        <w:rPr>
+          <w:rFonts w:ascii="Times New Roman" w:hAnsi="Times New Roman" w:cs="Times New Roman"/>
+          <w:lang w:val="en-US"/>
+        </w:rPr>
+      </w:pPr>
+      <w:r>
+        <w:rPr>
+          <w:rFonts w:ascii="Times New Roman" w:hAnsi="Times New Roman" w:cs="Times New Roman"/>
           <w:b/>
           <w:bCs/>
           <w:lang w:val="en-US"/>
@@ -471,9 +501,17 @@
       </w:r>
       <w:r>
         <w:rPr>
-          <w:lang w:val="en-US"/>
-        </w:rPr>
-        <w:t xml:space="preserve"> Used for math: + (add), - (subtract), * (multiply), / (divide), % (remainder).</w:t>
+          <w:rFonts w:ascii="Times New Roman" w:hAnsi="Times New Roman" w:cs="Times New Roman"/>
+          <w:lang w:val="en-US"/>
+        </w:rPr>
+        <w:t xml:space="preserve"> </w:t>
+      </w:r>
+      <w:r>
+        <w:rPr>
+          <w:rFonts w:ascii="Times New Roman" w:hAnsi="Times New Roman" w:cs="Times New Roman"/>
+          <w:lang w:val="en-US"/>
+        </w:rPr>
+        <w:t>sed in arithmetic operations; +, -, *, /, %.</w:t>
       </w:r>
     </w:p>
     <w:p>
@@ -484,11 +522,13 @@
           <w:numId w:val="6"/>
         </w:numPr>
         <w:rPr>
-          <w:lang w:val="en-US"/>
-        </w:rPr>
-      </w:pPr>
-      <w:r>
-        <w:rPr>
+          <w:rFonts w:ascii="Times New Roman" w:hAnsi="Times New Roman" w:cs="Times New Roman"/>
+          <w:lang w:val="en-US"/>
+        </w:rPr>
+      </w:pPr>
+      <w:r>
+        <w:rPr>
+          <w:rFonts w:ascii="Times New Roman" w:hAnsi="Times New Roman" w:cs="Times New Roman"/>
           <w:b/>
           <w:bCs/>
           <w:lang w:val="en-US"/>
@@ -497,23 +537,17 @@
       </w:r>
       <w:r>
         <w:rPr>
-          <w:lang w:val="en-US"/>
-        </w:rPr>
-        <w:t xml:space="preserve"> Compare two values: ==, !=, &gt;, &lt;, &gt;=, &lt;</w:t>
-      </w:r>
-      <w:proofErr w:type="gramStart"/>
-      <w:r>
-        <w:rPr>
-          <w:lang w:val="en-US"/>
-        </w:rPr>
-        <w:t>= — result is</w:t>
-      </w:r>
-      <w:proofErr w:type="gramEnd"/>
-      <w:r>
-        <w:rPr>
-          <w:lang w:val="en-US"/>
-        </w:rPr>
-        <w:t xml:space="preserve"> always true or false.</w:t>
+          <w:rFonts w:ascii="Times New Roman" w:hAnsi="Times New Roman" w:cs="Times New Roman"/>
+          <w:lang w:val="en-US"/>
+        </w:rPr>
+        <w:t xml:space="preserve"> </w:t>
+      </w:r>
+      <w:r>
+        <w:rPr>
+          <w:rFonts w:ascii="Times New Roman" w:hAnsi="Times New Roman" w:cs="Times New Roman"/>
+          <w:lang w:val="en-US"/>
+        </w:rPr>
+        <w:t>used for comparing two operands, ==, !=, &gt;, &lt;, &gt;=, &lt;=; results in boolean value either true or false.</w:t>
       </w:r>
     </w:p>
     <w:p>
@@ -524,11 +558,13 @@
           <w:numId w:val="6"/>
         </w:numPr>
         <w:rPr>
-          <w:lang w:val="en-US"/>
-        </w:rPr>
-      </w:pPr>
-      <w:r>
-        <w:rPr>
+          <w:rFonts w:ascii="Times New Roman" w:hAnsi="Times New Roman" w:cs="Times New Roman"/>
+          <w:lang w:val="en-US"/>
+        </w:rPr>
+      </w:pPr>
+      <w:r>
+        <w:rPr>
+          <w:rFonts w:ascii="Times New Roman" w:hAnsi="Times New Roman" w:cs="Times New Roman"/>
           <w:b/>
           <w:bCs/>
           <w:lang w:val="en-US"/>
@@ -537,23 +573,10 @@
       </w:r>
       <w:r>
         <w:rPr>
-          <w:lang w:val="en-US"/>
-        </w:rPr>
-        <w:t xml:space="preserve"> Combine conditions: &amp;&amp; (AND), || (OR)</w:t>
-      </w:r>
-      <w:proofErr w:type="gramStart"/>
-      <w:r>
-        <w:rPr>
-          <w:lang w:val="en-US"/>
-        </w:rPr>
-        <w:t>, !</w:t>
-      </w:r>
-      <w:proofErr w:type="gramEnd"/>
-      <w:r>
-        <w:rPr>
-          <w:lang w:val="en-US"/>
-        </w:rPr>
-        <w:t xml:space="preserve"> (NOT).</w:t>
+          <w:rFonts w:ascii="Times New Roman" w:hAnsi="Times New Roman" w:cs="Times New Roman"/>
+          <w:lang w:val="en-US"/>
+        </w:rPr>
+        <w:t xml:space="preserve"> Combine conditions: &amp;&amp; (AND), || (OR), ! (NOT).</w:t>
       </w:r>
     </w:p>
     <w:p>
@@ -564,11 +587,13 @@
           <w:numId w:val="6"/>
         </w:numPr>
         <w:rPr>
-          <w:lang w:val="en-US"/>
-        </w:rPr>
-      </w:pPr>
-      <w:r>
-        <w:rPr>
+          <w:rFonts w:ascii="Times New Roman" w:hAnsi="Times New Roman" w:cs="Times New Roman"/>
+          <w:lang w:val="en-US"/>
+        </w:rPr>
+      </w:pPr>
+      <w:r>
+        <w:rPr>
+          <w:rFonts w:ascii="Times New Roman" w:hAnsi="Times New Roman" w:cs="Times New Roman"/>
           <w:b/>
           <w:bCs/>
           <w:lang w:val="en-US"/>
@@ -577,10 +602,34 @@
       </w:r>
       <w:r>
         <w:rPr>
-          <w:lang w:val="en-US"/>
-        </w:rPr>
-        <w:t xml:space="preserve"> Assign values to variables: =, +=, -=, *=, /=</w:t>
-      </w:r>
+          <w:rFonts w:ascii="Times New Roman" w:hAnsi="Times New Roman" w:cs="Times New Roman"/>
+          <w:lang w:val="en-US"/>
+        </w:rPr>
+        <w:t xml:space="preserve"> </w:t>
+      </w:r>
+      <w:r>
+        <w:rPr>
+          <w:rFonts w:ascii="Times New Roman" w:hAnsi="Times New Roman" w:cs="Times New Roman"/>
+          <w:lang w:val="en-US"/>
+        </w:rPr>
+        <w:t>used for assigning values to variables; =, +=, -=, *=, /=.</w:t>
+      </w:r>
+    </w:p>
+    <w:p>
+      <w:pPr>
+        <w:rPr>
+          <w:rFonts w:ascii="Times New Roman" w:hAnsi="Times New Roman" w:cs="Times New Roman"/>
+          <w:lang w:val="en-US"/>
+        </w:rPr>
+      </w:pPr>
+    </w:p>
+    <w:p>
+      <w:pPr>
+        <w:rPr>
+          <w:rFonts w:ascii="Times New Roman" w:hAnsi="Times New Roman" w:cs="Times New Roman"/>
+          <w:lang w:val="en-US"/>
+        </w:rPr>
+      </w:pPr>
     </w:p>
     <w:p>
       <w:pPr>
@@ -590,11 +639,13 @@
           <w:numId w:val="2"/>
         </w:numPr>
         <w:rPr>
-          <w:lang w:val="en-US"/>
-        </w:rPr>
-      </w:pPr>
-      <w:r>
-        <w:rPr>
+          <w:rFonts w:ascii="Times New Roman" w:hAnsi="Times New Roman" w:cs="Times New Roman"/>
+          <w:lang w:val="en-US"/>
+        </w:rPr>
+      </w:pPr>
+      <w:r>
+        <w:rPr>
+          <w:rFonts w:ascii="Times New Roman" w:hAnsi="Times New Roman" w:cs="Times New Roman"/>
           <w:lang w:val="en-US"/>
         </w:rPr>
         <w:t>Control Flow</w:t>
@@ -608,11 +659,13 @@
           <w:numId w:val="7"/>
         </w:numPr>
         <w:rPr>
-          <w:lang w:val="en-US"/>
-        </w:rPr>
-      </w:pPr>
-      <w:r>
-        <w:rPr>
+          <w:rFonts w:ascii="Times New Roman" w:hAnsi="Times New Roman" w:cs="Times New Roman"/>
+          <w:lang w:val="en-US"/>
+        </w:rPr>
+      </w:pPr>
+      <w:r>
+        <w:rPr>
+          <w:rFonts w:ascii="Times New Roman" w:hAnsi="Times New Roman" w:cs="Times New Roman"/>
           <w:b/>
           <w:bCs/>
           <w:lang w:val="en-US"/>
@@ -621,9 +674,17 @@
       </w:r>
       <w:r>
         <w:rPr>
-          <w:lang w:val="en-US"/>
-        </w:rPr>
-        <w:t xml:space="preserve"> Runs different blocks of code depending on whether a condition is true or false.</w:t>
+          <w:rFonts w:ascii="Times New Roman" w:hAnsi="Times New Roman" w:cs="Times New Roman"/>
+          <w:lang w:val="en-US"/>
+        </w:rPr>
+        <w:t xml:space="preserve"> </w:t>
+      </w:r>
+      <w:r>
+        <w:rPr>
+          <w:rFonts w:ascii="Times New Roman" w:hAnsi="Times New Roman" w:cs="Times New Roman"/>
+          <w:lang w:val="en-US"/>
+        </w:rPr>
+        <w:t>Executes different blocks of code depending upon whether a certain condition is true or false.</w:t>
       </w:r>
     </w:p>
     <w:p>
@@ -634,23 +695,69 @@
           <w:numId w:val="7"/>
         </w:numPr>
         <w:rPr>
-          <w:lang w:val="en-US"/>
-        </w:rPr>
-      </w:pPr>
-      <w:r>
-        <w:rPr>
+          <w:rFonts w:ascii="Times New Roman" w:hAnsi="Times New Roman" w:cs="Times New Roman"/>
+          <w:lang w:val="en-US"/>
+        </w:rPr>
+      </w:pPr>
+      <w:r>
+        <w:rPr>
+          <w:rFonts w:ascii="Times New Roman" w:hAnsi="Times New Roman" w:cs="Times New Roman"/>
+          <w:b/>
+          <w:bCs/>
+          <w:lang w:val="en-US"/>
+        </w:rPr>
+        <w:t>switch:</w:t>
+      </w:r>
+      <w:r>
+        <w:rPr>
+          <w:rFonts w:ascii="Times New Roman" w:hAnsi="Times New Roman" w:cs="Times New Roman"/>
+          <w:lang w:val="en-US"/>
+        </w:rPr>
+        <w:t xml:space="preserve"> </w:t>
+      </w:r>
+      <w:r>
+        <w:rPr>
+          <w:rFonts w:ascii="Times New Roman" w:hAnsi="Times New Roman" w:cs="Times New Roman"/>
+          <w:lang w:val="en-US"/>
+        </w:rPr>
+        <w:t>Executes only one block of code out of the various alternatives available depending upon the value of a certain variable.</w:t>
+      </w:r>
+    </w:p>
+    <w:p>
+      <w:pPr>
+        <w:pStyle w:val="ListParagraph"/>
+        <w:numPr>
+          <w:ilvl w:val="0"/>
+          <w:numId w:val="7"/>
+        </w:numPr>
+        <w:rPr>
+          <w:rFonts w:ascii="Times New Roman" w:hAnsi="Times New Roman" w:cs="Times New Roman"/>
+          <w:lang w:val="en-US"/>
+        </w:rPr>
+      </w:pPr>
+      <w:r>
+        <w:rPr>
+          <w:rFonts w:ascii="Times New Roman" w:hAnsi="Times New Roman" w:cs="Times New Roman"/>
           <w:b/>
           <w:bCs/>
           <w:lang w:val="en-US"/>
         </w:rPr>
         <w:lastRenderedPageBreak/>
-        <w:t>switch:</w:t>
-      </w:r>
-      <w:r>
-        <w:rPr>
-          <w:lang w:val="en-US"/>
-        </w:rPr>
-        <w:t xml:space="preserve"> Chooses one block of code to run out of many options, based on a variable's value.</w:t>
+        <w:t>for loop:</w:t>
+      </w:r>
+      <w:r>
+        <w:rPr>
+          <w:rFonts w:ascii="Times New Roman" w:hAnsi="Times New Roman" w:cs="Times New Roman"/>
+          <w:lang w:val="en-US"/>
+        </w:rPr>
+        <w:t xml:space="preserve"> </w:t>
+      </w:r>
+      <w:r>
+        <w:rPr>
+          <w:rFonts w:ascii="Times New Roman" w:hAnsi="Times New Roman" w:cs="Times New Roman"/>
+          <w:lang w:val="en-US"/>
+        </w:rPr>
+        <w:t>Executes a code for a set number of times, useful when the number of iterations is known.</w:t>
       </w:r>
     </w:p>
     <w:p>
@@ -661,22 +768,32 @@
           <w:numId w:val="7"/>
         </w:numPr>
         <w:rPr>
-          <w:lang w:val="en-US"/>
-        </w:rPr>
-      </w:pPr>
-      <w:r>
-        <w:rPr>
-          <w:b/>
-          <w:bCs/>
-          <w:lang w:val="en-US"/>
-        </w:rPr>
-        <w:t>for loop:</w:t>
-      </w:r>
-      <w:r>
-        <w:rPr>
-          <w:lang w:val="en-US"/>
-        </w:rPr>
-        <w:t xml:space="preserve"> Repeats code a specific number of times, useful when the count is known.</w:t>
+          <w:rFonts w:ascii="Times New Roman" w:hAnsi="Times New Roman" w:cs="Times New Roman"/>
+          <w:lang w:val="en-US"/>
+        </w:rPr>
+      </w:pPr>
+      <w:r>
+        <w:rPr>
+          <w:rFonts w:ascii="Times New Roman" w:hAnsi="Times New Roman" w:cs="Times New Roman"/>
+          <w:b/>
+          <w:bCs/>
+          <w:lang w:val="en-US"/>
+        </w:rPr>
+        <w:t>While loop:</w:t>
+      </w:r>
+      <w:r>
+        <w:rPr>
+          <w:rFonts w:ascii="Times New Roman" w:hAnsi="Times New Roman" w:cs="Times New Roman"/>
+          <w:lang w:val="en-US"/>
+        </w:rPr>
+        <w:t xml:space="preserve"> </w:t>
+      </w:r>
+      <w:r>
+        <w:rPr>
+          <w:rFonts w:ascii="Times New Roman" w:hAnsi="Times New Roman" w:cs="Times New Roman"/>
+          <w:lang w:val="en-US"/>
+        </w:rPr>
+        <w:t>Keeps executing a certain code till a particular condition holds true.</w:t>
       </w:r>
     </w:p>
     <w:p>
@@ -687,30 +804,32 @@
           <w:numId w:val="7"/>
         </w:numPr>
         <w:rPr>
-          <w:lang w:val="en-US"/>
-        </w:rPr>
-      </w:pPr>
-      <w:r>
-        <w:rPr>
-          <w:b/>
-          <w:bCs/>
-          <w:lang w:val="en-US"/>
-        </w:rPr>
-        <w:t>While</w:t>
-      </w:r>
-      <w:r>
-        <w:rPr>
-          <w:b/>
-          <w:bCs/>
-          <w:lang w:val="en-US"/>
-        </w:rPr>
-        <w:t xml:space="preserve"> loop:</w:t>
-      </w:r>
-      <w:r>
-        <w:rPr>
-          <w:lang w:val="en-US"/>
-        </w:rPr>
-        <w:t xml:space="preserve"> Repeats code as long as a condition remains true.</w:t>
+          <w:rFonts w:ascii="Times New Roman" w:hAnsi="Times New Roman" w:cs="Times New Roman"/>
+          <w:lang w:val="en-US"/>
+        </w:rPr>
+      </w:pPr>
+      <w:r>
+        <w:rPr>
+          <w:rFonts w:ascii="Times New Roman" w:hAnsi="Times New Roman" w:cs="Times New Roman"/>
+          <w:b/>
+          <w:bCs/>
+          <w:lang w:val="en-US"/>
+        </w:rPr>
+        <w:t>do-while loop:</w:t>
+      </w:r>
+      <w:r>
+        <w:rPr>
+          <w:rFonts w:ascii="Times New Roman" w:hAnsi="Times New Roman" w:cs="Times New Roman"/>
+          <w:lang w:val="en-US"/>
+        </w:rPr>
+        <w:t xml:space="preserve"> </w:t>
+      </w:r>
+      <w:r>
+        <w:rPr>
+          <w:rFonts w:ascii="Times New Roman" w:hAnsi="Times New Roman" w:cs="Times New Roman"/>
+          <w:lang w:val="en-US"/>
+        </w:rPr>
+        <w:t>Similar to while statement but ensures that the statement gets executed at least once even if the condition is not satisfied.</w:t>
       </w:r>
     </w:p>
     <w:p>
@@ -721,49 +840,13 @@
           <w:numId w:val="7"/>
         </w:numPr>
         <w:rPr>
-          <w:lang w:val="en-US"/>
-        </w:rPr>
-      </w:pPr>
-      <w:r>
-        <w:rPr>
-          <w:b/>
-          <w:bCs/>
-          <w:lang w:val="en-US"/>
-        </w:rPr>
-        <w:t>do-while loop:</w:t>
-      </w:r>
-      <w:r>
-        <w:rPr>
-          <w:lang w:val="en-US"/>
-        </w:rPr>
-        <w:t xml:space="preserve"> Like a while </w:t>
-      </w:r>
-      <w:r>
-        <w:rPr>
-          <w:lang w:val="en-US"/>
-        </w:rPr>
-        <w:t>loop but</w:t>
-      </w:r>
-      <w:r>
-        <w:rPr>
-          <w:lang w:val="en-US"/>
-        </w:rPr>
-        <w:t xml:space="preserve"> always runs the code at least once before checking the condition.</w:t>
-      </w:r>
-    </w:p>
-    <w:p>
-      <w:pPr>
-        <w:pStyle w:val="ListParagraph"/>
-        <w:numPr>
-          <w:ilvl w:val="0"/>
-          <w:numId w:val="7"/>
-        </w:numPr>
-        <w:rPr>
-          <w:lang w:val="en-US"/>
-        </w:rPr>
-      </w:pPr>
-      <w:r>
-        <w:rPr>
+          <w:rFonts w:ascii="Times New Roman" w:hAnsi="Times New Roman" w:cs="Times New Roman"/>
+          <w:lang w:val="en-US"/>
+        </w:rPr>
+      </w:pPr>
+      <w:r>
+        <w:rPr>
+          <w:rFonts w:ascii="Times New Roman" w:hAnsi="Times New Roman" w:cs="Times New Roman"/>
           <w:b/>
           <w:bCs/>
           <w:lang w:val="en-US"/>
@@ -772,9 +855,17 @@
       </w:r>
       <w:r>
         <w:rPr>
-          <w:lang w:val="en-US"/>
-        </w:rPr>
-        <w:t xml:space="preserve"> Goes through each item in a collection (like an array or list) one by one.</w:t>
+          <w:rFonts w:ascii="Times New Roman" w:hAnsi="Times New Roman" w:cs="Times New Roman"/>
+          <w:lang w:val="en-US"/>
+        </w:rPr>
+        <w:t xml:space="preserve"> </w:t>
+      </w:r>
+      <w:r>
+        <w:rPr>
+          <w:rFonts w:ascii="Times New Roman" w:hAnsi="Times New Roman" w:cs="Times New Roman"/>
+          <w:lang w:val="en-US"/>
+        </w:rPr>
+        <w:t>Iterates through all items in a particular set (like arrays or list) one after the other.</w:t>
       </w:r>
     </w:p>
     <w:p>
@@ -785,11 +876,13 @@
           <w:numId w:val="2"/>
         </w:numPr>
         <w:rPr>
-          <w:lang w:val="en-US"/>
-        </w:rPr>
-      </w:pPr>
-      <w:r>
-        <w:rPr>
+          <w:rFonts w:ascii="Times New Roman" w:hAnsi="Times New Roman" w:cs="Times New Roman"/>
+          <w:lang w:val="en-US"/>
+        </w:rPr>
+      </w:pPr>
+      <w:r>
+        <w:rPr>
+          <w:rFonts w:ascii="Times New Roman" w:hAnsi="Times New Roman" w:cs="Times New Roman"/>
           <w:lang w:val="en-US"/>
         </w:rPr>
         <w:t>Methods</w:t>
@@ -803,11 +896,13 @@
           <w:numId w:val="8"/>
         </w:numPr>
         <w:rPr>
-          <w:lang w:val="en-US"/>
-        </w:rPr>
-      </w:pPr>
-      <w:r>
-        <w:rPr>
+          <w:rFonts w:ascii="Times New Roman" w:hAnsi="Times New Roman" w:cs="Times New Roman"/>
+          <w:lang w:val="en-US"/>
+        </w:rPr>
+      </w:pPr>
+      <w:r>
+        <w:rPr>
+          <w:rFonts w:ascii="Times New Roman" w:hAnsi="Times New Roman" w:cs="Times New Roman"/>
           <w:b/>
           <w:bCs/>
           <w:lang w:val="en-US"/>
@@ -816,6 +911,7 @@
       </w:r>
       <w:r>
         <w:rPr>
+          <w:rFonts w:ascii="Times New Roman" w:hAnsi="Times New Roman" w:cs="Times New Roman"/>
           <w:lang w:val="en-US"/>
         </w:rPr>
         <w:t xml:space="preserve"> A named block of reusable code that performs a task and can be called by name.</w:t>
@@ -829,11 +925,13 @@
           <w:numId w:val="8"/>
         </w:numPr>
         <w:rPr>
-          <w:lang w:val="en-US"/>
-        </w:rPr>
-      </w:pPr>
-      <w:r>
-        <w:rPr>
+          <w:rFonts w:ascii="Times New Roman" w:hAnsi="Times New Roman" w:cs="Times New Roman"/>
+          <w:lang w:val="en-US"/>
+        </w:rPr>
+      </w:pPr>
+      <w:r>
+        <w:rPr>
+          <w:rFonts w:ascii="Times New Roman" w:hAnsi="Times New Roman" w:cs="Times New Roman"/>
           <w:b/>
           <w:bCs/>
           <w:lang w:val="en-US"/>
@@ -842,23 +940,17 @@
       </w:r>
       <w:r>
         <w:rPr>
-          <w:lang w:val="en-US"/>
-        </w:rPr>
-        <w:t xml:space="preserve"> Values passed into a method so </w:t>
-      </w:r>
-      <w:proofErr w:type="gramStart"/>
-      <w:r>
-        <w:rPr>
-          <w:lang w:val="en-US"/>
-        </w:rPr>
-        <w:t>it</w:t>
-      </w:r>
-      <w:proofErr w:type="gramEnd"/>
-      <w:r>
-        <w:rPr>
-          <w:lang w:val="en-US"/>
-        </w:rPr>
-        <w:t xml:space="preserve"> can use them while running.</w:t>
+          <w:rFonts w:ascii="Times New Roman" w:hAnsi="Times New Roman" w:cs="Times New Roman"/>
+          <w:lang w:val="en-US"/>
+        </w:rPr>
+        <w:t xml:space="preserve"> </w:t>
+      </w:r>
+      <w:r>
+        <w:rPr>
+          <w:rFonts w:ascii="Times New Roman" w:hAnsi="Times New Roman" w:cs="Times New Roman"/>
+          <w:lang w:val="en-US"/>
+        </w:rPr>
+        <w:t>Data values used by a method to execute an operation.</w:t>
       </w:r>
     </w:p>
     <w:p>
@@ -869,11 +961,13 @@
           <w:numId w:val="8"/>
         </w:numPr>
         <w:rPr>
-          <w:lang w:val="en-US"/>
-        </w:rPr>
-      </w:pPr>
-      <w:r>
-        <w:rPr>
+          <w:rFonts w:ascii="Times New Roman" w:hAnsi="Times New Roman" w:cs="Times New Roman"/>
+          <w:lang w:val="en-US"/>
+        </w:rPr>
+      </w:pPr>
+      <w:r>
+        <w:rPr>
+          <w:rFonts w:ascii="Times New Roman" w:hAnsi="Times New Roman" w:cs="Times New Roman"/>
           <w:b/>
           <w:bCs/>
           <w:lang w:val="en-US"/>
@@ -882,9 +976,17 @@
       </w:r>
       <w:r>
         <w:rPr>
-          <w:lang w:val="en-US"/>
-        </w:rPr>
-        <w:t xml:space="preserve"> The result a method sends back after it finishes running.</w:t>
+          <w:rFonts w:ascii="Times New Roman" w:hAnsi="Times New Roman" w:cs="Times New Roman"/>
+          <w:lang w:val="en-US"/>
+        </w:rPr>
+        <w:t xml:space="preserve"> </w:t>
+      </w:r>
+      <w:r>
+        <w:rPr>
+          <w:rFonts w:ascii="Times New Roman" w:hAnsi="Times New Roman" w:cs="Times New Roman"/>
+          <w:lang w:val="en-US"/>
+        </w:rPr>
+        <w:t>This is the output of a method after executing an operation.</w:t>
       </w:r>
     </w:p>
     <w:p>
@@ -895,11 +997,13 @@
           <w:numId w:val="8"/>
         </w:numPr>
         <w:rPr>
-          <w:lang w:val="en-US"/>
-        </w:rPr>
-      </w:pPr>
-      <w:r>
-        <w:rPr>
+          <w:rFonts w:ascii="Times New Roman" w:hAnsi="Times New Roman" w:cs="Times New Roman"/>
+          <w:lang w:val="en-US"/>
+        </w:rPr>
+      </w:pPr>
+      <w:r>
+        <w:rPr>
+          <w:rFonts w:ascii="Times New Roman" w:hAnsi="Times New Roman" w:cs="Times New Roman"/>
           <w:b/>
           <w:bCs/>
           <w:lang w:val="en-US"/>
@@ -908,9 +1012,17 @@
       </w:r>
       <w:r>
         <w:rPr>
-          <w:lang w:val="en-US"/>
-        </w:rPr>
-        <w:t xml:space="preserve"> Means a method does not return any value.</w:t>
+          <w:rFonts w:ascii="Times New Roman" w:hAnsi="Times New Roman" w:cs="Times New Roman"/>
+          <w:lang w:val="en-US"/>
+        </w:rPr>
+        <w:t xml:space="preserve"> </w:t>
+      </w:r>
+      <w:r>
+        <w:rPr>
+          <w:rFonts w:ascii="Times New Roman" w:hAnsi="Times New Roman" w:cs="Times New Roman"/>
+          <w:lang w:val="en-US"/>
+        </w:rPr>
+        <w:t>Indicates that a method does not produce any output.</w:t>
       </w:r>
     </w:p>
     <w:p>
@@ -921,11 +1033,13 @@
           <w:numId w:val="2"/>
         </w:numPr>
         <w:rPr>
-          <w:lang w:val="en-US"/>
-        </w:rPr>
-      </w:pPr>
-      <w:r>
-        <w:rPr>
+          <w:rFonts w:ascii="Times New Roman" w:hAnsi="Times New Roman" w:cs="Times New Roman"/>
+          <w:lang w:val="en-US"/>
+        </w:rPr>
+      </w:pPr>
+      <w:r>
+        <w:rPr>
+          <w:rFonts w:ascii="Times New Roman" w:hAnsi="Times New Roman" w:cs="Times New Roman"/>
           <w:lang w:val="en-US"/>
         </w:rPr>
         <w:t>Object-Oriented Basics</w:t>
@@ -939,11 +1053,13 @@
           <w:numId w:val="9"/>
         </w:numPr>
         <w:rPr>
-          <w:lang w:val="en-US"/>
-        </w:rPr>
-      </w:pPr>
-      <w:r>
-        <w:rPr>
+          <w:rFonts w:ascii="Times New Roman" w:hAnsi="Times New Roman" w:cs="Times New Roman"/>
+          <w:lang w:val="en-US"/>
+        </w:rPr>
+      </w:pPr>
+      <w:r>
+        <w:rPr>
+          <w:rFonts w:ascii="Times New Roman" w:hAnsi="Times New Roman" w:cs="Times New Roman"/>
           <w:b/>
           <w:bCs/>
           <w:lang w:val="en-US"/>
@@ -952,23 +1068,17 @@
       </w:r>
       <w:r>
         <w:rPr>
+          <w:rFonts w:ascii="Times New Roman" w:hAnsi="Times New Roman" w:cs="Times New Roman"/>
           <w:lang w:val="en-US"/>
         </w:rPr>
         <w:t xml:space="preserve"> </w:t>
       </w:r>
-      <w:proofErr w:type="gramStart"/>
-      <w:r>
-        <w:rPr>
-          <w:lang w:val="en-US"/>
-        </w:rPr>
-        <w:t>A specific instance of a class,</w:t>
-      </w:r>
-      <w:proofErr w:type="gramEnd"/>
-      <w:r>
-        <w:rPr>
-          <w:lang w:val="en-US"/>
-        </w:rPr>
-        <w:t xml:space="preserve"> created using the 'new' keyword.</w:t>
+      <w:r>
+        <w:rPr>
+          <w:rFonts w:ascii="Times New Roman" w:hAnsi="Times New Roman" w:cs="Times New Roman"/>
+          <w:lang w:val="en-US"/>
+        </w:rPr>
+        <w:t>This refers to a block of code which is named and performs an operation. The object can be called using the name.</w:t>
       </w:r>
     </w:p>
     <w:p>
@@ -979,11 +1089,13 @@
           <w:numId w:val="9"/>
         </w:numPr>
         <w:rPr>
-          <w:lang w:val="en-US"/>
-        </w:rPr>
-      </w:pPr>
-      <w:r>
-        <w:rPr>
+          <w:rFonts w:ascii="Times New Roman" w:hAnsi="Times New Roman" w:cs="Times New Roman"/>
+          <w:lang w:val="en-US"/>
+        </w:rPr>
+      </w:pPr>
+      <w:r>
+        <w:rPr>
+          <w:rFonts w:ascii="Times New Roman" w:hAnsi="Times New Roman" w:cs="Times New Roman"/>
           <w:b/>
           <w:bCs/>
           <w:lang w:val="en-US"/>
@@ -992,9 +1104,17 @@
       </w:r>
       <w:r>
         <w:rPr>
-          <w:lang w:val="en-US"/>
-        </w:rPr>
-        <w:t xml:space="preserve"> A variable declared inside a class that stores an object's data.</w:t>
+          <w:rFonts w:ascii="Times New Roman" w:hAnsi="Times New Roman" w:cs="Times New Roman"/>
+          <w:lang w:val="en-US"/>
+        </w:rPr>
+        <w:t xml:space="preserve"> </w:t>
+      </w:r>
+      <w:r>
+        <w:rPr>
+          <w:rFonts w:ascii="Times New Roman" w:hAnsi="Times New Roman" w:cs="Times New Roman"/>
+          <w:lang w:val="en-US"/>
+        </w:rPr>
+        <w:t>This is a variable which is declared within a class and holds the information for an object.</w:t>
       </w:r>
     </w:p>
     <w:p>
@@ -1005,11 +1125,13 @@
           <w:numId w:val="9"/>
         </w:numPr>
         <w:rPr>
-          <w:lang w:val="en-US"/>
-        </w:rPr>
-      </w:pPr>
-      <w:r>
-        <w:rPr>
+          <w:rFonts w:ascii="Times New Roman" w:hAnsi="Times New Roman" w:cs="Times New Roman"/>
+          <w:lang w:val="en-US"/>
+        </w:rPr>
+      </w:pPr>
+      <w:r>
+        <w:rPr>
+          <w:rFonts w:ascii="Times New Roman" w:hAnsi="Times New Roman" w:cs="Times New Roman"/>
           <w:b/>
           <w:bCs/>
           <w:lang w:val="en-US"/>
@@ -1018,9 +1140,17 @@
       </w:r>
       <w:r>
         <w:rPr>
-          <w:lang w:val="en-US"/>
-        </w:rPr>
-        <w:t xml:space="preserve"> A member that controls access to a field, usually with get and set.</w:t>
+          <w:rFonts w:ascii="Times New Roman" w:hAnsi="Times New Roman" w:cs="Times New Roman"/>
+          <w:lang w:val="en-US"/>
+        </w:rPr>
+        <w:t xml:space="preserve"> </w:t>
+      </w:r>
+      <w:r>
+        <w:rPr>
+          <w:rFonts w:ascii="Times New Roman" w:hAnsi="Times New Roman" w:cs="Times New Roman"/>
+          <w:lang w:val="en-US"/>
+        </w:rPr>
+        <w:t>This is a member which controls the accessibility of fields using get and set.</w:t>
       </w:r>
     </w:p>
     <w:p>
@@ -1031,11 +1161,13 @@
           <w:numId w:val="9"/>
         </w:numPr>
         <w:rPr>
-          <w:lang w:val="en-US"/>
-        </w:rPr>
-      </w:pPr>
-      <w:r>
-        <w:rPr>
+          <w:rFonts w:ascii="Times New Roman" w:hAnsi="Times New Roman" w:cs="Times New Roman"/>
+          <w:lang w:val="en-US"/>
+        </w:rPr>
+      </w:pPr>
+      <w:r>
+        <w:rPr>
+          <w:rFonts w:ascii="Times New Roman" w:hAnsi="Times New Roman" w:cs="Times New Roman"/>
           <w:b/>
           <w:bCs/>
           <w:lang w:val="en-US"/>
@@ -1044,9 +1176,17 @@
       </w:r>
       <w:r>
         <w:rPr>
-          <w:lang w:val="en-US"/>
-        </w:rPr>
-        <w:t xml:space="preserve"> A special method that runs automatically when an object is created, used to set up initial values.</w:t>
+          <w:rFonts w:ascii="Times New Roman" w:hAnsi="Times New Roman" w:cs="Times New Roman"/>
+          <w:lang w:val="en-US"/>
+        </w:rPr>
+        <w:t xml:space="preserve"> </w:t>
+      </w:r>
+      <w:r>
+        <w:rPr>
+          <w:rFonts w:ascii="Times New Roman" w:hAnsi="Times New Roman" w:cs="Times New Roman"/>
+          <w:lang w:val="en-US"/>
+        </w:rPr>
+        <w:t>It is a special function which executes itself when an object is created. This is normally used for initializing the object.</w:t>
       </w:r>
     </w:p>
     <w:p>
@@ -1057,11 +1197,13 @@
           <w:numId w:val="9"/>
         </w:numPr>
         <w:rPr>
-          <w:lang w:val="en-US"/>
-        </w:rPr>
-      </w:pPr>
-      <w:r>
-        <w:rPr>
+          <w:rFonts w:ascii="Times New Roman" w:hAnsi="Times New Roman" w:cs="Times New Roman"/>
+          <w:lang w:val="en-US"/>
+        </w:rPr>
+      </w:pPr>
+      <w:r>
+        <w:rPr>
+          <w:rFonts w:ascii="Times New Roman" w:hAnsi="Times New Roman" w:cs="Times New Roman"/>
           <w:b/>
           <w:bCs/>
           <w:lang w:val="en-US"/>
@@ -1070,9 +1212,17 @@
       </w:r>
       <w:r>
         <w:rPr>
-          <w:lang w:val="en-US"/>
-        </w:rPr>
-        <w:t xml:space="preserve"> Allows a class to reuse and extend the members of another class.</w:t>
+          <w:rFonts w:ascii="Times New Roman" w:hAnsi="Times New Roman" w:cs="Times New Roman"/>
+          <w:lang w:val="en-US"/>
+        </w:rPr>
+        <w:t xml:space="preserve"> </w:t>
+      </w:r>
+      <w:r>
+        <w:rPr>
+          <w:rFonts w:ascii="Times New Roman" w:hAnsi="Times New Roman" w:cs="Times New Roman"/>
+          <w:lang w:val="en-US"/>
+        </w:rPr>
+        <w:t>It enables one class to use the members defined in another class.</w:t>
       </w:r>
     </w:p>
     <w:p>
@@ -1083,11 +1233,13 @@
           <w:numId w:val="9"/>
         </w:numPr>
         <w:rPr>
-          <w:lang w:val="en-US"/>
-        </w:rPr>
-      </w:pPr>
-      <w:r>
-        <w:rPr>
+          <w:rFonts w:ascii="Times New Roman" w:hAnsi="Times New Roman" w:cs="Times New Roman"/>
+          <w:lang w:val="en-US"/>
+        </w:rPr>
+      </w:pPr>
+      <w:r>
+        <w:rPr>
+          <w:rFonts w:ascii="Times New Roman" w:hAnsi="Times New Roman" w:cs="Times New Roman"/>
           <w:b/>
           <w:bCs/>
           <w:lang w:val="en-US"/>
@@ -1096,9 +1248,17 @@
       </w:r>
       <w:r>
         <w:rPr>
-          <w:lang w:val="en-US"/>
-        </w:rPr>
-        <w:t xml:space="preserve"> Hiding internal details of a class and only exposing what is necessary through public members.</w:t>
+          <w:rFonts w:ascii="Times New Roman" w:hAnsi="Times New Roman" w:cs="Times New Roman"/>
+          <w:lang w:val="en-US"/>
+        </w:rPr>
+        <w:t xml:space="preserve"> </w:t>
+      </w:r>
+      <w:r>
+        <w:rPr>
+          <w:rFonts w:ascii="Times New Roman" w:hAnsi="Times New Roman" w:cs="Times New Roman"/>
+          <w:lang w:val="en-US"/>
+        </w:rPr>
+        <w:t>It involves hiding the details of a class and making the essential members visible through public members.</w:t>
       </w:r>
     </w:p>
     <w:p>
@@ -1109,11 +1269,13 @@
           <w:numId w:val="9"/>
         </w:numPr>
         <w:rPr>
-          <w:lang w:val="en-US"/>
-        </w:rPr>
-      </w:pPr>
-      <w:r>
-        <w:rPr>
+          <w:rFonts w:ascii="Times New Roman" w:hAnsi="Times New Roman" w:cs="Times New Roman"/>
+          <w:lang w:val="en-US"/>
+        </w:rPr>
+      </w:pPr>
+      <w:r>
+        <w:rPr>
+          <w:rFonts w:ascii="Times New Roman" w:hAnsi="Times New Roman" w:cs="Times New Roman"/>
           <w:b/>
           <w:bCs/>
           <w:lang w:val="en-US"/>
@@ -1122,9 +1284,17 @@
       </w:r>
       <w:r>
         <w:rPr>
-          <w:lang w:val="en-US"/>
-        </w:rPr>
-        <w:t xml:space="preserve"> Allows the same method name to behave differently depending on the object calling it.</w:t>
+          <w:rFonts w:ascii="Times New Roman" w:hAnsi="Times New Roman" w:cs="Times New Roman"/>
+          <w:lang w:val="en-US"/>
+        </w:rPr>
+        <w:t xml:space="preserve"> </w:t>
+      </w:r>
+      <w:r>
+        <w:rPr>
+          <w:rFonts w:ascii="Times New Roman" w:hAnsi="Times New Roman" w:cs="Times New Roman"/>
+          <w:lang w:val="en-US"/>
+        </w:rPr>
+        <w:t>The same method name behaves differently when called by different objects.</w:t>
       </w:r>
     </w:p>
     <w:p>
@@ -1135,11 +1305,13 @@
           <w:numId w:val="2"/>
         </w:numPr>
         <w:rPr>
-          <w:lang w:val="en-US"/>
-        </w:rPr>
-      </w:pPr>
-      <w:r>
-        <w:rPr>
+          <w:rFonts w:ascii="Times New Roman" w:hAnsi="Times New Roman" w:cs="Times New Roman"/>
+          <w:lang w:val="en-US"/>
+        </w:rPr>
+      </w:pPr>
+      <w:r>
+        <w:rPr>
+          <w:rFonts w:ascii="Times New Roman" w:hAnsi="Times New Roman" w:cs="Times New Roman"/>
           <w:lang w:val="en-US"/>
         </w:rPr>
         <w:t>Collections</w:t>
@@ -1153,11 +1325,13 @@
           <w:numId w:val="10"/>
         </w:numPr>
         <w:rPr>
-          <w:lang w:val="en-US"/>
-        </w:rPr>
-      </w:pPr>
-      <w:r>
-        <w:rPr>
+          <w:rFonts w:ascii="Times New Roman" w:hAnsi="Times New Roman" w:cs="Times New Roman"/>
+          <w:lang w:val="en-US"/>
+        </w:rPr>
+      </w:pPr>
+      <w:r>
+        <w:rPr>
+          <w:rFonts w:ascii="Times New Roman" w:hAnsi="Times New Roman" w:cs="Times New Roman"/>
           <w:b/>
           <w:bCs/>
           <w:lang w:val="en-US"/>
@@ -1166,23 +1340,17 @@
       </w:r>
       <w:r>
         <w:rPr>
-          <w:lang w:val="en-US"/>
-        </w:rPr>
-        <w:t xml:space="preserve"> A fixed-size list of items of the same type, e.g. </w:t>
-      </w:r>
-      <w:proofErr w:type="gramStart"/>
-      <w:r>
-        <w:rPr>
-          <w:lang w:val="en-US"/>
-        </w:rPr>
-        <w:t>int[</w:t>
-      </w:r>
-      <w:proofErr w:type="gramEnd"/>
-      <w:r>
-        <w:rPr>
-          <w:lang w:val="en-US"/>
-        </w:rPr>
-        <w:t>] numbers.</w:t>
+          <w:rFonts w:ascii="Times New Roman" w:hAnsi="Times New Roman" w:cs="Times New Roman"/>
+          <w:lang w:val="en-US"/>
+        </w:rPr>
+        <w:t xml:space="preserve"> </w:t>
+      </w:r>
+      <w:r>
+        <w:rPr>
+          <w:rFonts w:ascii="Times New Roman" w:hAnsi="Times New Roman" w:cs="Times New Roman"/>
+          <w:lang w:val="en-US"/>
+        </w:rPr>
+        <w:t>An array is a fixed number of similar elements, like int[] number.</w:t>
       </w:r>
     </w:p>
     <w:p>
@@ -1193,11 +1361,13 @@
           <w:numId w:val="10"/>
         </w:numPr>
         <w:rPr>
-          <w:lang w:val="en-US"/>
-        </w:rPr>
-      </w:pPr>
-      <w:r>
-        <w:rPr>
+          <w:rFonts w:ascii="Times New Roman" w:hAnsi="Times New Roman" w:cs="Times New Roman"/>
+          <w:lang w:val="en-US"/>
+        </w:rPr>
+      </w:pPr>
+      <w:r>
+        <w:rPr>
+          <w:rFonts w:ascii="Times New Roman" w:hAnsi="Times New Roman" w:cs="Times New Roman"/>
           <w:b/>
           <w:bCs/>
           <w:lang w:val="en-US"/>
@@ -1206,22 +1376,186 @@
       </w:r>
       <w:r>
         <w:rPr>
-          <w:lang w:val="en-US"/>
-        </w:rPr>
-        <w:t xml:space="preserve"> A resizable collection of items, part of </w:t>
-      </w:r>
-      <w:proofErr w:type="spellStart"/>
-      <w:proofErr w:type="gramStart"/>
-      <w:r>
-        <w:rPr>
-          <w:lang w:val="en-US"/>
-        </w:rPr>
-        <w:t>System.Collections.Generic</w:t>
-      </w:r>
-      <w:proofErr w:type="spellEnd"/>
-      <w:proofErr w:type="gramEnd"/>
-      <w:r>
-        <w:rPr>
+          <w:rFonts w:ascii="Times New Roman" w:hAnsi="Times New Roman" w:cs="Times New Roman"/>
+          <w:lang w:val="en-US"/>
+        </w:rPr>
+        <w:t xml:space="preserve"> </w:t>
+      </w:r>
+      <w:r>
+        <w:rPr>
+          <w:rFonts w:ascii="Times New Roman" w:hAnsi="Times New Roman" w:cs="Times New Roman"/>
+          <w:lang w:val="en-US"/>
+        </w:rPr>
+        <w:t>It is a flexible list of elements belonging to System.Collections.Generic.</w:t>
+      </w:r>
+    </w:p>
+    <w:p>
+      <w:pPr>
+        <w:pStyle w:val="ListParagraph"/>
+        <w:numPr>
+          <w:ilvl w:val="0"/>
+          <w:numId w:val="10"/>
+        </w:numPr>
+        <w:rPr>
+          <w:rFonts w:ascii="Times New Roman" w:hAnsi="Times New Roman" w:cs="Times New Roman"/>
+          <w:lang w:val="en-US"/>
+        </w:rPr>
+      </w:pPr>
+      <w:r>
+        <w:rPr>
+          <w:rFonts w:ascii="Times New Roman" w:hAnsi="Times New Roman" w:cs="Times New Roman"/>
+          <w:b/>
+          <w:bCs/>
+          <w:lang w:val="en-US"/>
+        </w:rPr>
+        <w:t>Dictionary&lt;TKey, TValue&gt;:</w:t>
+      </w:r>
+      <w:r>
+        <w:rPr>
+          <w:rFonts w:ascii="Times New Roman" w:hAnsi="Times New Roman" w:cs="Times New Roman"/>
+          <w:lang w:val="en-US"/>
+        </w:rPr>
+        <w:t xml:space="preserve"> </w:t>
+      </w:r>
+      <w:r>
+        <w:rPr>
+          <w:rFonts w:ascii="Times New Roman" w:hAnsi="Times New Roman" w:cs="Times New Roman"/>
+          <w:lang w:val="en-US"/>
+        </w:rPr>
+        <w:t>This is a list of elements stored as key-value pair.</w:t>
+      </w:r>
+    </w:p>
+    <w:p>
+      <w:pPr>
+        <w:pStyle w:val="Heading1"/>
+        <w:numPr>
+          <w:ilvl w:val="0"/>
+          <w:numId w:val="2"/>
+        </w:numPr>
+        <w:rPr>
+          <w:rFonts w:ascii="Times New Roman" w:hAnsi="Times New Roman" w:cs="Times New Roman"/>
+          <w:lang w:val="en-US"/>
+        </w:rPr>
+      </w:pPr>
+      <w:r>
+        <w:rPr>
+          <w:rFonts w:ascii="Times New Roman" w:hAnsi="Times New Roman" w:cs="Times New Roman"/>
+          <w:lang w:val="en-US"/>
+        </w:rPr>
+        <w:t>Exception Handling</w:t>
+      </w:r>
+    </w:p>
+    <w:p>
+      <w:pPr>
+        <w:pStyle w:val="ListParagraph"/>
+        <w:numPr>
+          <w:ilvl w:val="0"/>
+          <w:numId w:val="11"/>
+        </w:numPr>
+        <w:rPr>
+          <w:rFonts w:ascii="Times New Roman" w:hAnsi="Times New Roman" w:cs="Times New Roman"/>
+          <w:lang w:val="en-US"/>
+        </w:rPr>
+      </w:pPr>
+      <w:r>
+        <w:rPr>
+          <w:rFonts w:ascii="Times New Roman" w:hAnsi="Times New Roman" w:cs="Times New Roman"/>
+          <w:b/>
+          <w:bCs/>
+          <w:lang w:val="en-US"/>
+        </w:rPr>
+        <w:t>try / catch:</w:t>
+      </w:r>
+      <w:r>
+        <w:rPr>
+          <w:rFonts w:ascii="Times New Roman" w:hAnsi="Times New Roman" w:cs="Times New Roman"/>
+          <w:lang w:val="en-US"/>
+        </w:rPr>
+        <w:t xml:space="preserve"> </w:t>
+      </w:r>
+      <w:r>
+        <w:rPr>
+          <w:rFonts w:ascii="Times New Roman" w:hAnsi="Times New Roman" w:cs="Times New Roman"/>
+          <w:lang w:val="en-US"/>
+        </w:rPr>
+        <w:t>Allows code that may fail to be executed (try) and for any errors encountered to be safely handled (catch).</w:t>
+      </w:r>
+    </w:p>
+    <w:p>
+      <w:pPr>
+        <w:pStyle w:val="ListParagraph"/>
+        <w:numPr>
+          <w:ilvl w:val="0"/>
+          <w:numId w:val="11"/>
+        </w:numPr>
+        <w:rPr>
+          <w:rFonts w:ascii="Times New Roman" w:hAnsi="Times New Roman" w:cs="Times New Roman"/>
+          <w:lang w:val="en-US"/>
+        </w:rPr>
+      </w:pPr>
+      <w:r>
+        <w:rPr>
+          <w:rFonts w:ascii="Times New Roman" w:hAnsi="Times New Roman" w:cs="Times New Roman"/>
+          <w:b/>
+          <w:bCs/>
+          <w:lang w:val="en-US"/>
+        </w:rPr>
+        <w:lastRenderedPageBreak/>
+        <w:t>finally:</w:t>
+      </w:r>
+      <w:r>
+        <w:rPr>
+          <w:rFonts w:ascii="Times New Roman" w:hAnsi="Times New Roman" w:cs="Times New Roman"/>
+          <w:lang w:val="en-US"/>
+        </w:rPr>
+        <w:t xml:space="preserve"> </w:t>
+      </w:r>
+      <w:r>
+        <w:rPr>
+          <w:rFonts w:ascii="Times New Roman" w:hAnsi="Times New Roman" w:cs="Times New Roman"/>
+          <w:lang w:val="en-US"/>
+        </w:rPr>
+        <w:t>Block of code that executes regardless of an error occurring in the try-catch statement.</w:t>
+      </w:r>
+    </w:p>
+    <w:p>
+      <w:pPr>
+        <w:pStyle w:val="ListParagraph"/>
+        <w:numPr>
+          <w:ilvl w:val="0"/>
+          <w:numId w:val="11"/>
+        </w:numPr>
+        <w:rPr>
+          <w:rFonts w:ascii="Times New Roman" w:hAnsi="Times New Roman" w:cs="Times New Roman"/>
+          <w:lang w:val="en-US"/>
+        </w:rPr>
+      </w:pPr>
+      <w:r>
+        <w:rPr>
+          <w:rFonts w:ascii="Times New Roman" w:hAnsi="Times New Roman" w:cs="Times New Roman"/>
+          <w:b/>
+          <w:bCs/>
+          <w:lang w:val="en-US"/>
+        </w:rPr>
+        <w:t>Exception:</w:t>
+      </w:r>
+      <w:r>
+        <w:rPr>
+          <w:rFonts w:ascii="Times New Roman" w:hAnsi="Times New Roman" w:cs="Times New Roman"/>
+          <w:lang w:val="en-US"/>
+        </w:rPr>
+        <w:t xml:space="preserve"> </w:t>
+      </w:r>
+      <w:r>
+        <w:rPr>
+          <w:rFonts w:ascii="Times New Roman" w:hAnsi="Times New Roman" w:cs="Times New Roman"/>
+          <w:lang w:val="en-US"/>
+        </w:rPr>
+        <w:t>An object that represents an error in the program</w:t>
+      </w:r>
+      <w:r>
+        <w:rPr>
+          <w:rFonts w:ascii="Times New Roman" w:hAnsi="Times New Roman" w:cs="Times New Roman"/>
           <w:lang w:val="en-US"/>
         </w:rPr>
         <w:t>.</w:t>
@@ -1229,167 +1563,94 @@
     </w:p>
     <w:p>
       <w:pPr>
-        <w:pStyle w:val="ListParagraph"/>
-        <w:numPr>
-          <w:ilvl w:val="0"/>
-          <w:numId w:val="10"/>
-        </w:numPr>
-        <w:rPr>
-          <w:lang w:val="en-US"/>
-        </w:rPr>
-      </w:pPr>
-      <w:r>
-        <w:rPr>
-          <w:b/>
-          <w:bCs/>
-          <w:lang w:val="en-US"/>
-        </w:rPr>
-        <w:t>Dictionary&lt;</w:t>
-      </w:r>
-      <w:proofErr w:type="spellStart"/>
-      <w:r>
-        <w:rPr>
-          <w:b/>
-          <w:bCs/>
-          <w:lang w:val="en-US"/>
-        </w:rPr>
-        <w:t>TKey</w:t>
-      </w:r>
-      <w:proofErr w:type="spellEnd"/>
-      <w:r>
-        <w:rPr>
-          <w:b/>
-          <w:bCs/>
-          <w:lang w:val="en-US"/>
-        </w:rPr>
-        <w:t>, TValue&gt;:</w:t>
-      </w:r>
-      <w:r>
-        <w:rPr>
-          <w:lang w:val="en-US"/>
-        </w:rPr>
-        <w:t xml:space="preserve"> A collection that stores data as key-value pairs for fast lookup.</w:t>
-      </w:r>
-    </w:p>
-    <w:p>
-      <w:pPr>
         <w:pStyle w:val="Heading1"/>
         <w:numPr>
           <w:ilvl w:val="0"/>
           <w:numId w:val="2"/>
         </w:numPr>
         <w:rPr>
-          <w:lang w:val="en-US"/>
-        </w:rPr>
-      </w:pPr>
-      <w:r>
-        <w:rPr>
-          <w:lang w:val="en-US"/>
-        </w:rPr>
-        <w:lastRenderedPageBreak/>
-        <w:t>Exception Handling</w:t>
-      </w:r>
-    </w:p>
-    <w:p>
-      <w:pPr>
-        <w:pStyle w:val="ListParagraph"/>
-        <w:numPr>
-          <w:ilvl w:val="0"/>
-          <w:numId w:val="11"/>
-        </w:numPr>
-        <w:rPr>
-          <w:lang w:val="en-US"/>
-        </w:rPr>
-      </w:pPr>
-      <w:r>
-        <w:rPr>
-          <w:b/>
-          <w:bCs/>
-          <w:lang w:val="en-US"/>
-        </w:rPr>
-        <w:t>try / catch:</w:t>
-      </w:r>
-      <w:r>
-        <w:rPr>
-          <w:lang w:val="en-US"/>
-        </w:rPr>
-        <w:t xml:space="preserve"> Lets you run code that might fail (try) and handle the error safely if it happens (catch).</w:t>
-      </w:r>
-    </w:p>
-    <w:p>
-      <w:pPr>
-        <w:pStyle w:val="ListParagraph"/>
-        <w:numPr>
-          <w:ilvl w:val="0"/>
-          <w:numId w:val="11"/>
-        </w:numPr>
-        <w:rPr>
-          <w:lang w:val="en-US"/>
-        </w:rPr>
-      </w:pPr>
-      <w:proofErr w:type="gramStart"/>
-      <w:r>
-        <w:rPr>
-          <w:b/>
-          <w:bCs/>
-          <w:lang w:val="en-US"/>
-        </w:rPr>
-        <w:t>finally</w:t>
-      </w:r>
-      <w:proofErr w:type="gramEnd"/>
-      <w:r>
-        <w:rPr>
-          <w:b/>
-          <w:bCs/>
-          <w:lang w:val="en-US"/>
-        </w:rPr>
-        <w:t>:</w:t>
-      </w:r>
-      <w:r>
-        <w:rPr>
-          <w:lang w:val="en-US"/>
-        </w:rPr>
-        <w:t xml:space="preserve"> A block that always runs after try/catch, </w:t>
-      </w:r>
-      <w:proofErr w:type="gramStart"/>
-      <w:r>
-        <w:rPr>
-          <w:lang w:val="en-US"/>
-        </w:rPr>
-        <w:t>whether or not</w:t>
-      </w:r>
-      <w:proofErr w:type="gramEnd"/>
-      <w:r>
-        <w:rPr>
-          <w:lang w:val="en-US"/>
-        </w:rPr>
-        <w:t xml:space="preserve"> an error occurred.</w:t>
-      </w:r>
-    </w:p>
-    <w:p>
-      <w:pPr>
-        <w:pStyle w:val="ListParagraph"/>
-        <w:numPr>
-          <w:ilvl w:val="0"/>
-          <w:numId w:val="11"/>
-        </w:numPr>
-        <w:rPr>
-          <w:lang w:val="en-US"/>
-        </w:rPr>
-      </w:pPr>
-      <w:r>
-        <w:rPr>
-          <w:b/>
-          <w:bCs/>
-          <w:lang w:val="en-US"/>
-        </w:rPr>
-        <w:t>Exception:</w:t>
-      </w:r>
-      <w:r>
-        <w:rPr>
-          <w:lang w:val="en-US"/>
-        </w:rPr>
-        <w:t xml:space="preserve"> An object representing an error that occurs during program execution.</w:t>
+          <w:rFonts w:ascii="Times New Roman" w:hAnsi="Times New Roman" w:cs="Times New Roman"/>
+          <w:lang w:val="en-US"/>
+        </w:rPr>
+      </w:pPr>
+      <w:r>
+        <w:rPr>
+          <w:rFonts w:ascii="Times New Roman" w:hAnsi="Times New Roman" w:cs="Times New Roman"/>
+          <w:lang w:val="en-US"/>
+        </w:rPr>
+        <w:t>Type Conversion</w:t>
+      </w:r>
+    </w:p>
+    <w:p>
+      <w:pPr>
+        <w:pStyle w:val="ListParagraph"/>
+        <w:numPr>
+          <w:ilvl w:val="0"/>
+          <w:numId w:val="13"/>
+        </w:numPr>
+        <w:rPr>
+          <w:rFonts w:ascii="Times New Roman" w:hAnsi="Times New Roman" w:cs="Times New Roman"/>
+          <w:lang w:val="en-US"/>
+        </w:rPr>
+      </w:pPr>
+      <w:r>
+        <w:rPr>
+          <w:rFonts w:ascii="Times New Roman" w:hAnsi="Times New Roman" w:cs="Times New Roman"/>
+          <w:b/>
+          <w:bCs/>
+          <w:lang w:val="en-US"/>
+        </w:rPr>
+        <w:t>Type Casting:</w:t>
+      </w:r>
+      <w:r>
+        <w:rPr>
+          <w:rFonts w:ascii="Times New Roman" w:hAnsi="Times New Roman" w:cs="Times New Roman"/>
+          <w:lang w:val="en-US"/>
+        </w:rPr>
+        <w:t xml:space="preserve"> </w:t>
+      </w:r>
+      <w:r>
+        <w:rPr>
+          <w:rFonts w:ascii="Times New Roman" w:hAnsi="Times New Roman" w:cs="Times New Roman"/>
+          <w:lang w:val="en-US"/>
+        </w:rPr>
+        <w:t>Changing the type of an existing variable from one form to another, such as (int)myDouble.</w:t>
+      </w:r>
+    </w:p>
+    <w:p>
+      <w:pPr>
+        <w:pStyle w:val="ListParagraph"/>
+        <w:numPr>
+          <w:ilvl w:val="0"/>
+          <w:numId w:val="13"/>
+        </w:numPr>
+        <w:rPr>
+          <w:rFonts w:ascii="Times New Roman" w:hAnsi="Times New Roman" w:cs="Times New Roman"/>
+          <w:lang w:val="en-US"/>
+        </w:rPr>
+      </w:pPr>
+      <w:r>
+        <w:rPr>
+          <w:rFonts w:ascii="Times New Roman" w:hAnsi="Times New Roman" w:cs="Times New Roman"/>
+          <w:b/>
+          <w:bCs/>
+          <w:lang w:val="en-US"/>
+        </w:rPr>
+        <w:t>Convert Class:</w:t>
+      </w:r>
+      <w:r>
+        <w:rPr>
+          <w:rFonts w:ascii="Times New Roman" w:hAnsi="Times New Roman" w:cs="Times New Roman"/>
+          <w:lang w:val="en-US"/>
+        </w:rPr>
+        <w:t xml:space="preserve"> </w:t>
+      </w:r>
+      <w:r>
+        <w:rPr>
+          <w:rFonts w:ascii="Times New Roman" w:hAnsi="Times New Roman" w:cs="Times New Roman"/>
+          <w:lang w:val="en-US"/>
+        </w:rPr>
+        <w:t>Includes functions that allow type conversions, such as Convert.ToInt32() and Convert.ToString().</w:t>
       </w:r>
     </w:p>
     <w:p>
@@ -1400,104 +1661,131 @@
           <w:numId w:val="2"/>
         </w:numPr>
         <w:rPr>
-          <w:lang w:val="en-US"/>
-        </w:rPr>
-      </w:pPr>
-      <w:r>
-        <w:rPr>
-          <w:lang w:val="en-US"/>
-        </w:rPr>
-        <w:t>Type Conversion</w:t>
-      </w:r>
-    </w:p>
-    <w:p>
-      <w:pPr>
-        <w:pStyle w:val="ListParagraph"/>
-        <w:numPr>
-          <w:ilvl w:val="0"/>
-          <w:numId w:val="13"/>
-        </w:numPr>
-        <w:rPr>
-          <w:lang w:val="en-US"/>
-        </w:rPr>
-      </w:pPr>
-      <w:r>
-        <w:rPr>
-          <w:b/>
-          <w:bCs/>
-          <w:lang w:val="en-US"/>
-        </w:rPr>
-        <w:t>Type Casting:</w:t>
-      </w:r>
-      <w:r>
-        <w:rPr>
-          <w:lang w:val="en-US"/>
-        </w:rPr>
-        <w:t xml:space="preserve"> Converting a value from one data type to another, e.g. (int)</w:t>
-      </w:r>
-      <w:proofErr w:type="spellStart"/>
-      <w:r>
-        <w:rPr>
-          <w:lang w:val="en-US"/>
-        </w:rPr>
-        <w:t>myDouble</w:t>
-      </w:r>
-      <w:proofErr w:type="spellEnd"/>
-      <w:r>
-        <w:rPr>
-          <w:lang w:val="en-US"/>
-        </w:rPr>
-        <w:t>.</w:t>
-      </w:r>
-    </w:p>
-    <w:p>
-      <w:pPr>
-        <w:pStyle w:val="ListParagraph"/>
-        <w:numPr>
-          <w:ilvl w:val="0"/>
-          <w:numId w:val="13"/>
-        </w:numPr>
-        <w:rPr>
-          <w:lang w:val="en-US"/>
-        </w:rPr>
-      </w:pPr>
-      <w:proofErr w:type="spellStart"/>
-      <w:r>
-        <w:rPr>
-          <w:b/>
-          <w:bCs/>
-          <w:lang w:val="en-US"/>
-        </w:rPr>
-        <w:t>Convert</w:t>
-      </w:r>
-      <w:proofErr w:type="spellEnd"/>
-      <w:r>
-        <w:rPr>
-          <w:b/>
-          <w:bCs/>
-          <w:lang w:val="en-US"/>
-        </w:rPr>
-        <w:t xml:space="preserve"> Class:</w:t>
-      </w:r>
-      <w:r>
-        <w:rPr>
-          <w:lang w:val="en-US"/>
-        </w:rPr>
-        <w:t xml:space="preserve"> Provides methods like Convert.ToInt32() or </w:t>
-      </w:r>
-      <w:proofErr w:type="spellStart"/>
-      <w:r>
-        <w:rPr>
-          <w:lang w:val="en-US"/>
-        </w:rPr>
-        <w:t>Convert.ToString</w:t>
-      </w:r>
-      <w:proofErr w:type="spellEnd"/>
-      <w:r>
-        <w:rPr>
-          <w:lang w:val="en-US"/>
-        </w:rPr>
-        <w:t>() to safely convert between types.</w:t>
+          <w:rFonts w:ascii="Times New Roman" w:hAnsi="Times New Roman" w:cs="Times New Roman"/>
+          <w:lang w:val="en-US"/>
+        </w:rPr>
+      </w:pPr>
+      <w:r>
+        <w:rPr>
+          <w:rFonts w:ascii="Times New Roman" w:hAnsi="Times New Roman" w:cs="Times New Roman"/>
+          <w:lang w:val="en-US"/>
+        </w:rPr>
+        <w:t>Access Modifiers</w:t>
+      </w:r>
+    </w:p>
+    <w:p>
+      <w:pPr>
+        <w:pStyle w:val="ListParagraph"/>
+        <w:numPr>
+          <w:ilvl w:val="0"/>
+          <w:numId w:val="14"/>
+        </w:numPr>
+        <w:rPr>
+          <w:rFonts w:ascii="Times New Roman" w:hAnsi="Times New Roman" w:cs="Times New Roman"/>
+          <w:lang w:val="en-US"/>
+        </w:rPr>
+      </w:pPr>
+      <w:r>
+        <w:rPr>
+          <w:rFonts w:ascii="Times New Roman" w:hAnsi="Times New Roman" w:cs="Times New Roman"/>
+          <w:b/>
+          <w:bCs/>
+          <w:lang w:val="en-US"/>
+        </w:rPr>
+        <w:t>public:</w:t>
+      </w:r>
+      <w:r>
+        <w:rPr>
+          <w:rFonts w:ascii="Times New Roman" w:hAnsi="Times New Roman" w:cs="Times New Roman"/>
+          <w:lang w:val="en-US"/>
+        </w:rPr>
+        <w:t xml:space="preserve"> </w:t>
+      </w:r>
+      <w:r>
+        <w:rPr>
+          <w:rFonts w:ascii="Times New Roman" w:hAnsi="Times New Roman" w:cs="Times New Roman"/>
+          <w:lang w:val="en-US"/>
+        </w:rPr>
+        <w:t>The class member will be available from any part of the program.</w:t>
+      </w:r>
+    </w:p>
+    <w:p>
+      <w:pPr>
+        <w:pStyle w:val="ListParagraph"/>
+        <w:numPr>
+          <w:ilvl w:val="0"/>
+          <w:numId w:val="14"/>
+        </w:numPr>
+        <w:rPr>
+          <w:rFonts w:ascii="Times New Roman" w:hAnsi="Times New Roman" w:cs="Times New Roman"/>
+          <w:lang w:val="en-US"/>
+        </w:rPr>
+      </w:pPr>
+      <w:r>
+        <w:rPr>
+          <w:rFonts w:ascii="Times New Roman" w:hAnsi="Times New Roman" w:cs="Times New Roman"/>
+          <w:b/>
+          <w:bCs/>
+          <w:lang w:val="en-US"/>
+        </w:rPr>
+        <w:t>private:</w:t>
+      </w:r>
+      <w:r>
+        <w:rPr>
+          <w:rFonts w:ascii="Times New Roman" w:hAnsi="Times New Roman" w:cs="Times New Roman"/>
+          <w:lang w:val="en-US"/>
+        </w:rPr>
+        <w:t xml:space="preserve"> </w:t>
+      </w:r>
+      <w:r>
+        <w:rPr>
+          <w:rFonts w:ascii="Times New Roman" w:hAnsi="Times New Roman" w:cs="Times New Roman"/>
+          <w:lang w:val="en-US"/>
+        </w:rPr>
+        <w:t>Limits the availability of the class member to its own class only.</w:t>
+      </w:r>
+    </w:p>
+    <w:p>
+      <w:pPr>
+        <w:pStyle w:val="ListParagraph"/>
+        <w:numPr>
+          <w:ilvl w:val="0"/>
+          <w:numId w:val="14"/>
+        </w:numPr>
+        <w:rPr>
+          <w:rFonts w:ascii="Times New Roman" w:hAnsi="Times New Roman" w:cs="Times New Roman"/>
+          <w:lang w:val="en-US"/>
+        </w:rPr>
+      </w:pPr>
+      <w:r>
+        <w:rPr>
+          <w:rFonts w:ascii="Times New Roman" w:hAnsi="Times New Roman" w:cs="Times New Roman"/>
+          <w:b/>
+          <w:bCs/>
+          <w:lang w:val="en-US"/>
+        </w:rPr>
+        <w:t>protected:</w:t>
+      </w:r>
+      <w:r>
+        <w:rPr>
+          <w:rFonts w:ascii="Times New Roman" w:hAnsi="Times New Roman" w:cs="Times New Roman"/>
+          <w:lang w:val="en-US"/>
+        </w:rPr>
+        <w:t xml:space="preserve"> </w:t>
+      </w:r>
+      <w:r>
+        <w:rPr>
+          <w:rFonts w:ascii="Times New Roman" w:hAnsi="Times New Roman" w:cs="Times New Roman"/>
+          <w:lang w:val="en-US"/>
+        </w:rPr>
+        <w:t>The class member will be available in its own class as well as in all derived classe</w:t>
+      </w:r>
+      <w:r>
+        <w:rPr>
+          <w:rFonts w:ascii="Times New Roman" w:hAnsi="Times New Roman" w:cs="Times New Roman"/>
+          <w:lang w:val="en-US"/>
+        </w:rPr>
+        <w:t>s.</w:t>
       </w:r>
     </w:p>
     <w:p>
@@ -1508,106 +1796,88 @@
           <w:numId w:val="2"/>
         </w:numPr>
         <w:rPr>
-          <w:lang w:val="en-US"/>
-        </w:rPr>
-      </w:pPr>
-      <w:r>
-        <w:rPr>
-          <w:lang w:val="en-US"/>
-        </w:rPr>
-        <w:t>Access Modifiers</w:t>
-      </w:r>
-    </w:p>
-    <w:p>
-      <w:pPr>
-        <w:pStyle w:val="ListParagraph"/>
-        <w:numPr>
-          <w:ilvl w:val="0"/>
-          <w:numId w:val="14"/>
-        </w:numPr>
-        <w:rPr>
-          <w:lang w:val="en-US"/>
-        </w:rPr>
-      </w:pPr>
-      <w:r>
-        <w:rPr>
-          <w:b/>
-          <w:bCs/>
-          <w:lang w:val="en-US"/>
-        </w:rPr>
-        <w:t>public:</w:t>
-      </w:r>
-      <w:r>
-        <w:rPr>
-          <w:lang w:val="en-US"/>
-        </w:rPr>
-        <w:t xml:space="preserve"> Makes a class member accessible from anywhere in the program.</w:t>
-      </w:r>
-    </w:p>
-    <w:p>
-      <w:pPr>
-        <w:pStyle w:val="ListParagraph"/>
-        <w:numPr>
-          <w:ilvl w:val="0"/>
-          <w:numId w:val="14"/>
-        </w:numPr>
-        <w:rPr>
-          <w:lang w:val="en-US"/>
-        </w:rPr>
-      </w:pPr>
-      <w:r>
-        <w:rPr>
-          <w:b/>
-          <w:bCs/>
-          <w:lang w:val="en-US"/>
-        </w:rPr>
-        <w:t>private:</w:t>
-      </w:r>
-      <w:r>
-        <w:rPr>
-          <w:lang w:val="en-US"/>
-        </w:rPr>
-        <w:t xml:space="preserve"> Restricts a class member so it can only be accessed within the same class.</w:t>
-      </w:r>
-    </w:p>
-    <w:p>
-      <w:pPr>
-        <w:pStyle w:val="ListParagraph"/>
-        <w:numPr>
-          <w:ilvl w:val="0"/>
-          <w:numId w:val="14"/>
-        </w:numPr>
-        <w:rPr>
-          <w:lang w:val="en-US"/>
-        </w:rPr>
-      </w:pPr>
-      <w:r>
-        <w:rPr>
-          <w:b/>
-          <w:bCs/>
-          <w:lang w:val="en-US"/>
-        </w:rPr>
-        <w:t>protected:</w:t>
-      </w:r>
-      <w:r>
-        <w:rPr>
-          <w:lang w:val="en-US"/>
-        </w:rPr>
-        <w:t xml:space="preserve"> Allows a class member to be accessed within </w:t>
-      </w:r>
-      <w:proofErr w:type="gramStart"/>
-      <w:r>
-        <w:rPr>
-          <w:lang w:val="en-US"/>
-        </w:rPr>
-        <w:t>its</w:t>
-      </w:r>
-      <w:proofErr w:type="gramEnd"/>
-      <w:r>
-        <w:rPr>
-          <w:lang w:val="en-US"/>
-        </w:rPr>
-        <w:t xml:space="preserve"> own class and any derived (child) classes.</w:t>
+          <w:rFonts w:ascii="Times New Roman" w:hAnsi="Times New Roman" w:cs="Times New Roman"/>
+          <w:lang w:val="en-US"/>
+        </w:rPr>
+      </w:pPr>
+      <w:r>
+        <w:rPr>
+          <w:rFonts w:ascii="Times New Roman" w:hAnsi="Times New Roman" w:cs="Times New Roman"/>
+          <w:lang w:val="en-US"/>
+        </w:rPr>
+        <w:t>Enums and Interfaces</w:t>
+      </w:r>
+    </w:p>
+    <w:p>
+      <w:pPr>
+        <w:pStyle w:val="ListParagraph"/>
+        <w:numPr>
+          <w:ilvl w:val="0"/>
+          <w:numId w:val="15"/>
+        </w:numPr>
+        <w:rPr>
+          <w:rFonts w:ascii="Times New Roman" w:hAnsi="Times New Roman" w:cs="Times New Roman"/>
+          <w:lang w:val="en-US"/>
+        </w:rPr>
+      </w:pPr>
+      <w:r>
+        <w:rPr>
+          <w:rFonts w:ascii="Times New Roman" w:hAnsi="Times New Roman" w:cs="Times New Roman"/>
+          <w:b/>
+          <w:bCs/>
+          <w:lang w:val="en-US"/>
+        </w:rPr>
+        <w:t>Enum:</w:t>
+      </w:r>
+      <w:r>
+        <w:rPr>
+          <w:rFonts w:ascii="Times New Roman" w:hAnsi="Times New Roman" w:cs="Times New Roman"/>
+          <w:lang w:val="en-US"/>
+        </w:rPr>
+        <w:t xml:space="preserve"> </w:t>
+      </w:r>
+      <w:r>
+        <w:rPr>
+          <w:rFonts w:ascii="Times New Roman" w:hAnsi="Times New Roman" w:cs="Times New Roman"/>
+          <w:lang w:val="en-US"/>
+        </w:rPr>
+        <w:t>An enumerated data type is a collection of constants, for example, enum Days { Monday, Tuesday, Wednesday}.</w:t>
+      </w:r>
+    </w:p>
+    <w:p>
+      <w:pPr>
+        <w:pStyle w:val="ListParagraph"/>
+        <w:numPr>
+          <w:ilvl w:val="0"/>
+          <w:numId w:val="15"/>
+        </w:numPr>
+        <w:rPr>
+          <w:rFonts w:ascii="Times New Roman" w:hAnsi="Times New Roman" w:cs="Times New Roman"/>
+          <w:lang w:val="en-US"/>
+        </w:rPr>
+      </w:pPr>
+      <w:r>
+        <w:rPr>
+          <w:rFonts w:ascii="Times New Roman" w:hAnsi="Times New Roman" w:cs="Times New Roman"/>
+          <w:b/>
+          <w:bCs/>
+          <w:lang w:val="en-US"/>
+        </w:rPr>
+        <w:t>Interface:</w:t>
+      </w:r>
+      <w:r>
+        <w:rPr>
+          <w:rFonts w:ascii="Times New Roman" w:hAnsi="Times New Roman" w:cs="Times New Roman"/>
+          <w:lang w:val="en-US"/>
+        </w:rPr>
+        <w:t xml:space="preserve"> </w:t>
+      </w:r>
+      <w:r>
+        <w:rPr>
+          <w:rFonts w:ascii="Times New Roman" w:hAnsi="Times New Roman" w:cs="Times New Roman"/>
+          <w:lang w:val="en-US"/>
+        </w:rPr>
+        <w:t>An agreement about which methods have to be implemented by the class.</w:t>
       </w:r>
     </w:p>
     <w:p>
@@ -1618,108 +1888,160 @@
           <w:numId w:val="2"/>
         </w:numPr>
         <w:rPr>
-          <w:lang w:val="en-US"/>
-        </w:rPr>
-      </w:pPr>
-      <w:r>
-        <w:rPr>
-          <w:lang w:val="en-US"/>
-        </w:rPr>
-        <w:t>Enums and Interfaces</w:t>
-      </w:r>
-    </w:p>
-    <w:p>
-      <w:pPr>
-        <w:pStyle w:val="ListParagraph"/>
-        <w:numPr>
-          <w:ilvl w:val="0"/>
-          <w:numId w:val="15"/>
-        </w:numPr>
-        <w:rPr>
-          <w:lang w:val="en-US"/>
-        </w:rPr>
-      </w:pPr>
-      <w:r>
-        <w:rPr>
-          <w:b/>
-          <w:bCs/>
-          <w:lang w:val="en-US"/>
-        </w:rPr>
-        <w:t>Enum:</w:t>
-      </w:r>
-      <w:r>
-        <w:rPr>
-          <w:lang w:val="en-US"/>
-        </w:rPr>
-        <w:t xml:space="preserve"> A set of named constant values, e.g. </w:t>
-      </w:r>
-      <w:proofErr w:type="spellStart"/>
-      <w:r>
-        <w:rPr>
-          <w:lang w:val="en-US"/>
-        </w:rPr>
-        <w:t>enum</w:t>
-      </w:r>
-      <w:proofErr w:type="spellEnd"/>
-      <w:r>
-        <w:rPr>
-          <w:lang w:val="en-US"/>
-        </w:rPr>
-        <w:t xml:space="preserve"> Days </w:t>
-      </w:r>
-      <w:proofErr w:type="gramStart"/>
-      <w:r>
-        <w:rPr>
-          <w:lang w:val="en-US"/>
-        </w:rPr>
-        <w:t>{ Monday</w:t>
-      </w:r>
-      <w:proofErr w:type="gramEnd"/>
-      <w:r>
-        <w:rPr>
-          <w:lang w:val="en-US"/>
-        </w:rPr>
-        <w:t xml:space="preserve">, Tuesday, </w:t>
-      </w:r>
-      <w:proofErr w:type="gramStart"/>
-      <w:r>
-        <w:rPr>
-          <w:lang w:val="en-US"/>
-        </w:rPr>
-        <w:t>Wednesday }</w:t>
-      </w:r>
-      <w:proofErr w:type="gramEnd"/>
-      <w:r>
-        <w:rPr>
-          <w:lang w:val="en-US"/>
-        </w:rPr>
-        <w:t>.</w:t>
-      </w:r>
-    </w:p>
-    <w:p>
-      <w:pPr>
-        <w:pStyle w:val="ListParagraph"/>
-        <w:numPr>
-          <w:ilvl w:val="0"/>
-          <w:numId w:val="15"/>
-        </w:numPr>
-        <w:rPr>
-          <w:lang w:val="en-US"/>
-        </w:rPr>
-      </w:pPr>
-      <w:r>
-        <w:rPr>
-          <w:b/>
-          <w:bCs/>
-          <w:lang w:val="en-US"/>
-        </w:rPr>
-        <w:t>Interface:</w:t>
-      </w:r>
-      <w:r>
-        <w:rPr>
-          <w:lang w:val="en-US"/>
-        </w:rPr>
-        <w:t xml:space="preserve"> A contract that defines a set of methods a class must implement, without providing the implementation itself.</w:t>
+          <w:rFonts w:ascii="Times New Roman" w:hAnsi="Times New Roman" w:cs="Times New Roman"/>
+          <w:lang w:val="en-US"/>
+        </w:rPr>
+      </w:pPr>
+      <w:r>
+        <w:rPr>
+          <w:rFonts w:ascii="Times New Roman" w:hAnsi="Times New Roman" w:cs="Times New Roman"/>
+          <w:lang w:val="en-US"/>
+        </w:rPr>
+        <w:t>Shortcuts and Input/Output</w:t>
+      </w:r>
+    </w:p>
+    <w:p>
+      <w:pPr>
+        <w:pStyle w:val="ListParagraph"/>
+        <w:numPr>
+          <w:ilvl w:val="0"/>
+          <w:numId w:val="16"/>
+        </w:numPr>
+        <w:rPr>
+          <w:rFonts w:ascii="Times New Roman" w:hAnsi="Times New Roman" w:cs="Times New Roman"/>
+          <w:lang w:val="en-US"/>
+        </w:rPr>
+      </w:pPr>
+      <w:r>
+        <w:rPr>
+          <w:rFonts w:ascii="Times New Roman" w:hAnsi="Times New Roman" w:cs="Times New Roman"/>
+          <w:b/>
+          <w:bCs/>
+          <w:lang w:val="en-US"/>
+        </w:rPr>
+        <w:t>Ternary Operator:</w:t>
+      </w:r>
+      <w:r>
+        <w:rPr>
+          <w:rFonts w:ascii="Times New Roman" w:hAnsi="Times New Roman" w:cs="Times New Roman"/>
+          <w:lang w:val="en-US"/>
+        </w:rPr>
+        <w:t xml:space="preserve"> </w:t>
+      </w:r>
+      <w:r>
+        <w:rPr>
+          <w:rFonts w:ascii="Times New Roman" w:hAnsi="Times New Roman" w:cs="Times New Roman"/>
+          <w:lang w:val="en-US"/>
+        </w:rPr>
+        <w:t>An abbreviated form of if/else in a single statement; condition ? trueValue : falseValue.</w:t>
+      </w:r>
+    </w:p>
+    <w:p>
+      <w:pPr>
+        <w:pStyle w:val="ListParagraph"/>
+        <w:numPr>
+          <w:ilvl w:val="0"/>
+          <w:numId w:val="16"/>
+        </w:numPr>
+        <w:rPr>
+          <w:rFonts w:ascii="Times New Roman" w:hAnsi="Times New Roman" w:cs="Times New Roman"/>
+          <w:lang w:val="en-US"/>
+        </w:rPr>
+      </w:pPr>
+      <w:r>
+        <w:rPr>
+          <w:rFonts w:ascii="Times New Roman" w:hAnsi="Times New Roman" w:cs="Times New Roman"/>
+          <w:b/>
+          <w:bCs/>
+          <w:lang w:val="en-US"/>
+        </w:rPr>
+        <w:t>Increment / Decrement:</w:t>
+      </w:r>
+      <w:r>
+        <w:rPr>
+          <w:rFonts w:ascii="Times New Roman" w:hAnsi="Times New Roman" w:cs="Times New Roman"/>
+          <w:lang w:val="en-US"/>
+        </w:rPr>
+        <w:t xml:space="preserve"> </w:t>
+      </w:r>
+      <w:r>
+        <w:rPr>
+          <w:rFonts w:ascii="Times New Roman" w:hAnsi="Times New Roman" w:cs="Times New Roman"/>
+          <w:lang w:val="en-US"/>
+        </w:rPr>
+        <w:t>++ increases value by one, -- decreases value by one, such as count++.</w:t>
+      </w:r>
+    </w:p>
+    <w:p>
+      <w:pPr>
+        <w:pStyle w:val="ListParagraph"/>
+        <w:numPr>
+          <w:ilvl w:val="0"/>
+          <w:numId w:val="16"/>
+        </w:numPr>
+        <w:rPr>
+          <w:rFonts w:ascii="Times New Roman" w:hAnsi="Times New Roman" w:cs="Times New Roman"/>
+          <w:lang w:val="en-US"/>
+        </w:rPr>
+      </w:pPr>
+      <w:r>
+        <w:rPr>
+          <w:rFonts w:ascii="Times New Roman" w:hAnsi="Times New Roman" w:cs="Times New Roman"/>
+          <w:b/>
+          <w:bCs/>
+          <w:lang w:val="en-US"/>
+        </w:rPr>
+        <w:t>Console.ReadLine():</w:t>
+      </w:r>
+      <w:r>
+        <w:rPr>
+          <w:rFonts w:ascii="Times New Roman" w:hAnsi="Times New Roman" w:cs="Times New Roman"/>
+          <w:lang w:val="en-US"/>
+        </w:rPr>
+        <w:t xml:space="preserve"> </w:t>
+      </w:r>
+      <w:r>
+        <w:rPr>
+          <w:rFonts w:ascii="Times New Roman" w:hAnsi="Times New Roman" w:cs="Times New Roman"/>
+          <w:lang w:val="en-US"/>
+        </w:rPr>
+        <w:t>Reads a line entered by the user on the console.</w:t>
+      </w:r>
+    </w:p>
+    <w:p>
+      <w:pPr>
+        <w:pStyle w:val="ListParagraph"/>
+        <w:numPr>
+          <w:ilvl w:val="0"/>
+          <w:numId w:val="16"/>
+        </w:numPr>
+        <w:rPr>
+          <w:rFonts w:ascii="Times New Roman" w:hAnsi="Times New Roman" w:cs="Times New Roman"/>
+          <w:lang w:val="en-US"/>
+        </w:rPr>
+      </w:pPr>
+      <w:r>
+        <w:rPr>
+          <w:rFonts w:ascii="Times New Roman" w:hAnsi="Times New Roman" w:cs="Times New Roman"/>
+          <w:b/>
+          <w:bCs/>
+          <w:lang w:val="en-US"/>
+        </w:rPr>
+        <w:t>String Interpolation:</w:t>
+      </w:r>
+      <w:r>
+        <w:rPr>
+          <w:rFonts w:ascii="Times New Roman" w:hAnsi="Times New Roman" w:cs="Times New Roman"/>
+          <w:lang w:val="en-US"/>
+        </w:rPr>
+        <w:t xml:space="preserve"> </w:t>
+      </w:r>
+      <w:r>
+        <w:rPr>
+          <w:rFonts w:ascii="Times New Roman" w:hAnsi="Times New Roman" w:cs="Times New Roman"/>
+          <w:lang w:val="en-US"/>
+        </w:rPr>
+        <w:t>Inserting variables directly into a string using the dollar sign ($).</w:t>
       </w:r>
     </w:p>
     <w:p>
@@ -1730,195 +2052,52 @@
           <w:numId w:val="2"/>
         </w:numPr>
         <w:rPr>
-          <w:lang w:val="en-US"/>
-        </w:rPr>
-      </w:pPr>
-      <w:r>
-        <w:rPr>
-          <w:lang w:val="en-US"/>
-        </w:rPr>
-        <w:t>Shortcuts and Input/Output</w:t>
-      </w:r>
-    </w:p>
-    <w:p>
-      <w:pPr>
-        <w:pStyle w:val="ListParagraph"/>
-        <w:numPr>
-          <w:ilvl w:val="0"/>
-          <w:numId w:val="16"/>
-        </w:numPr>
-        <w:rPr>
-          <w:lang w:val="en-US"/>
-        </w:rPr>
-      </w:pPr>
-      <w:r>
-        <w:rPr>
-          <w:b/>
-          <w:bCs/>
-          <w:lang w:val="en-US"/>
-        </w:rPr>
-        <w:t>Ternary Operator:</w:t>
-      </w:r>
-      <w:r>
-        <w:rPr>
-          <w:lang w:val="en-US"/>
-        </w:rPr>
-        <w:t xml:space="preserve"> A shorthand for if/else in one line: condition ? </w:t>
-      </w:r>
-      <w:proofErr w:type="spellStart"/>
-      <w:proofErr w:type="gramStart"/>
-      <w:r>
-        <w:rPr>
-          <w:lang w:val="en-US"/>
-        </w:rPr>
-        <w:t>valueIfTrue</w:t>
-      </w:r>
-      <w:proofErr w:type="spellEnd"/>
-      <w:r>
-        <w:rPr>
-          <w:lang w:val="en-US"/>
-        </w:rPr>
-        <w:t xml:space="preserve"> :</w:t>
-      </w:r>
-      <w:proofErr w:type="gramEnd"/>
-      <w:r>
-        <w:rPr>
+          <w:rFonts w:ascii="Times New Roman" w:hAnsi="Times New Roman" w:cs="Times New Roman"/>
+          <w:lang w:val="en-US"/>
+        </w:rPr>
+      </w:pPr>
+      <w:r>
+        <w:rPr>
+          <w:rFonts w:ascii="Times New Roman" w:hAnsi="Times New Roman" w:cs="Times New Roman"/>
+          <w:lang w:val="en-US"/>
+        </w:rPr>
+        <w:t>Others</w:t>
+      </w:r>
+    </w:p>
+    <w:p>
+      <w:pPr>
+        <w:pStyle w:val="ListParagraph"/>
+        <w:numPr>
+          <w:ilvl w:val="0"/>
+          <w:numId w:val="12"/>
+        </w:numPr>
+        <w:rPr>
+          <w:rFonts w:ascii="Times New Roman" w:hAnsi="Times New Roman" w:cs="Times New Roman"/>
+          <w:lang w:val="en-US"/>
+        </w:rPr>
+      </w:pPr>
+      <w:r>
+        <w:rPr>
+          <w:rFonts w:ascii="Times New Roman" w:hAnsi="Times New Roman" w:cs="Times New Roman"/>
+          <w:b/>
+          <w:bCs/>
+          <w:lang w:val="en-US"/>
+        </w:rPr>
+        <w:t>Comment:</w:t>
+      </w:r>
+      <w:r>
+        <w:rPr>
+          <w:rFonts w:ascii="Times New Roman" w:hAnsi="Times New Roman" w:cs="Times New Roman"/>
           <w:lang w:val="en-US"/>
         </w:rPr>
         <w:t xml:space="preserve"> </w:t>
       </w:r>
-      <w:proofErr w:type="spellStart"/>
-      <w:r>
-        <w:rPr>
-          <w:lang w:val="en-US"/>
-        </w:rPr>
-        <w:t>valueIfFalse</w:t>
-      </w:r>
-      <w:proofErr w:type="spellEnd"/>
-      <w:r>
-        <w:rPr>
-          <w:lang w:val="en-US"/>
-        </w:rPr>
-        <w:t>.</w:t>
-      </w:r>
-    </w:p>
-    <w:p>
-      <w:pPr>
-        <w:pStyle w:val="ListParagraph"/>
-        <w:numPr>
-          <w:ilvl w:val="0"/>
-          <w:numId w:val="16"/>
-        </w:numPr>
-        <w:rPr>
-          <w:lang w:val="en-US"/>
-        </w:rPr>
-      </w:pPr>
-      <w:r>
-        <w:rPr>
-          <w:b/>
-          <w:bCs/>
-          <w:lang w:val="en-US"/>
-        </w:rPr>
-        <w:t>Increment / Decrement:</w:t>
-      </w:r>
-      <w:r>
-        <w:rPr>
-          <w:lang w:val="en-US"/>
-        </w:rPr>
-        <w:t xml:space="preserve"> ++ adds 1 to a variable, -- subtracts 1, e.g. count++.</w:t>
-      </w:r>
-    </w:p>
-    <w:p>
-      <w:pPr>
-        <w:pStyle w:val="ListParagraph"/>
-        <w:numPr>
-          <w:ilvl w:val="0"/>
-          <w:numId w:val="16"/>
-        </w:numPr>
-        <w:rPr>
-          <w:lang w:val="en-US"/>
-        </w:rPr>
-      </w:pPr>
-      <w:proofErr w:type="spellStart"/>
-      <w:r>
-        <w:rPr>
-          <w:b/>
-          <w:bCs/>
-          <w:lang w:val="en-US"/>
-        </w:rPr>
-        <w:t>Console.ReadLine</w:t>
-      </w:r>
-      <w:proofErr w:type="spellEnd"/>
-      <w:r>
-        <w:rPr>
-          <w:b/>
-          <w:bCs/>
-          <w:lang w:val="en-US"/>
-        </w:rPr>
-        <w:t>():</w:t>
-      </w:r>
-      <w:r>
-        <w:rPr>
-          <w:lang w:val="en-US"/>
-        </w:rPr>
-        <w:t xml:space="preserve"> Reads a line of text typed by the user from the console.</w:t>
-      </w:r>
-    </w:p>
-    <w:p>
-      <w:pPr>
-        <w:pStyle w:val="ListParagraph"/>
-        <w:numPr>
-          <w:ilvl w:val="0"/>
-          <w:numId w:val="16"/>
-        </w:numPr>
-        <w:rPr>
-          <w:lang w:val="en-US"/>
-        </w:rPr>
-      </w:pPr>
-      <w:r>
-        <w:rPr>
-          <w:b/>
-          <w:bCs/>
-          <w:lang w:val="en-US"/>
-        </w:rPr>
-        <w:t>String Interpolation:</w:t>
-      </w:r>
-      <w:r>
-        <w:rPr>
-          <w:lang w:val="en-US"/>
-        </w:rPr>
-        <w:t xml:space="preserve"> Embeds variables directly inside a string using $, e.g. $"Hello {name}".</w:t>
-      </w:r>
-    </w:p>
-    <w:p>
-      <w:pPr>
-        <w:pStyle w:val="Heading1"/>
-        <w:numPr>
-          <w:ilvl w:val="0"/>
-          <w:numId w:val="2"/>
-        </w:numPr>
-        <w:rPr>
-          <w:lang w:val="en-US"/>
-        </w:rPr>
-      </w:pPr>
-      <w:r>
-        <w:rPr>
-          <w:lang w:val="en-US"/>
-        </w:rPr>
-        <w:lastRenderedPageBreak/>
-        <w:t>Ot</w:t>
-      </w:r>
-      <w:r>
-        <w:rPr>
-          <w:lang w:val="en-US"/>
-        </w:rPr>
-        <w:t>h</w:t>
-      </w:r>
-      <w:r>
-        <w:rPr>
-          <w:lang w:val="en-US"/>
-        </w:rPr>
-        <w:t>ers</w:t>
+      <w:r>
+        <w:rPr>
+          <w:rFonts w:ascii="Times New Roman" w:hAnsi="Times New Roman" w:cs="Times New Roman"/>
+          <w:lang w:val="en-US"/>
+        </w:rPr>
+        <w:t>Text that is not compiled, used for describing code (// single line, /* multi-line */).</w:t>
       </w:r>
     </w:p>
     <w:p>
@@ -1929,22 +2108,32 @@
           <w:numId w:val="12"/>
         </w:numPr>
         <w:rPr>
-          <w:lang w:val="en-US"/>
-        </w:rPr>
-      </w:pPr>
-      <w:r>
-        <w:rPr>
-          <w:b/>
-          <w:bCs/>
-          <w:lang w:val="en-US"/>
-        </w:rPr>
-        <w:t>Comment:</w:t>
-      </w:r>
-      <w:r>
-        <w:rPr>
-          <w:lang w:val="en-US"/>
-        </w:rPr>
-        <w:t xml:space="preserve"> Text ignored by the compiler, used to explain code (// single line, /* multi line */).</w:t>
+          <w:rFonts w:ascii="Times New Roman" w:hAnsi="Times New Roman" w:cs="Times New Roman"/>
+          <w:lang w:val="en-US"/>
+        </w:rPr>
+      </w:pPr>
+      <w:r>
+        <w:rPr>
+          <w:rFonts w:ascii="Times New Roman" w:hAnsi="Times New Roman" w:cs="Times New Roman"/>
+          <w:b/>
+          <w:bCs/>
+          <w:lang w:val="en-US"/>
+        </w:rPr>
+        <w:t>Console.WriteLine():</w:t>
+      </w:r>
+      <w:r>
+        <w:rPr>
+          <w:rFonts w:ascii="Times New Roman" w:hAnsi="Times New Roman" w:cs="Times New Roman"/>
+          <w:lang w:val="en-US"/>
+        </w:rPr>
+        <w:t xml:space="preserve"> </w:t>
+      </w:r>
+      <w:r>
+        <w:rPr>
+          <w:rFonts w:ascii="Times New Roman" w:hAnsi="Times New Roman" w:cs="Times New Roman"/>
+          <w:lang w:val="en-US"/>
+        </w:rPr>
+        <w:t>Displays text on the console screen followed by a new line.</w:t>
       </w:r>
     </w:p>
     <w:p>
@@ -1955,32 +2144,32 @@
           <w:numId w:val="12"/>
         </w:numPr>
         <w:rPr>
-          <w:lang w:val="en-US"/>
-        </w:rPr>
-      </w:pPr>
-      <w:proofErr w:type="spellStart"/>
-      <w:r>
-        <w:rPr>
-          <w:b/>
-          <w:bCs/>
-          <w:lang w:val="en-US"/>
-        </w:rPr>
-        <w:t>Console.WriteLine</w:t>
-      </w:r>
-      <w:proofErr w:type="spellEnd"/>
-      <w:r>
-        <w:rPr>
-          <w:b/>
-          <w:bCs/>
-          <w:lang w:val="en-US"/>
-        </w:rPr>
-        <w:t>():</w:t>
-      </w:r>
-      <w:r>
-        <w:rPr>
-          <w:lang w:val="en-US"/>
-        </w:rPr>
-        <w:t xml:space="preserve"> Prints text to the console screen, followed by a new line.</w:t>
+          <w:rFonts w:ascii="Times New Roman" w:hAnsi="Times New Roman" w:cs="Times New Roman"/>
+          <w:lang w:val="en-US"/>
+        </w:rPr>
+      </w:pPr>
+      <w:r>
+        <w:rPr>
+          <w:rFonts w:ascii="Times New Roman" w:hAnsi="Times New Roman" w:cs="Times New Roman"/>
+          <w:b/>
+          <w:bCs/>
+          <w:lang w:val="en-US"/>
+        </w:rPr>
+        <w:t>Null:</w:t>
+      </w:r>
+      <w:r>
+        <w:rPr>
+          <w:rFonts w:ascii="Times New Roman" w:hAnsi="Times New Roman" w:cs="Times New Roman"/>
+          <w:lang w:val="en-US"/>
+        </w:rPr>
+        <w:t xml:space="preserve"> </w:t>
+      </w:r>
+      <w:r>
+        <w:rPr>
+          <w:rFonts w:ascii="Times New Roman" w:hAnsi="Times New Roman" w:cs="Times New Roman"/>
+          <w:lang w:val="en-US"/>
+        </w:rPr>
+        <w:t>Denotes lack of value/object.</w:t>
       </w:r>
     </w:p>
     <w:p>
@@ -1991,49 +2180,13 @@
           <w:numId w:val="12"/>
         </w:numPr>
         <w:rPr>
-          <w:lang w:val="en-US"/>
-        </w:rPr>
-      </w:pPr>
-      <w:r>
-        <w:rPr>
-          <w:b/>
-          <w:bCs/>
-          <w:lang w:val="en-US"/>
-        </w:rPr>
-        <w:t>Null:</w:t>
-      </w:r>
-      <w:r>
-        <w:rPr>
-          <w:lang w:val="en-US"/>
-        </w:rPr>
-        <w:t xml:space="preserve"> Represents the absence of </w:t>
-      </w:r>
-      <w:r>
-        <w:rPr>
-          <w:lang w:val="en-US"/>
-        </w:rPr>
-        <w:t>value</w:t>
-      </w:r>
-      <w:r>
-        <w:rPr>
-          <w:lang w:val="en-US"/>
-        </w:rPr>
-        <w:t xml:space="preserve"> or object.</w:t>
-      </w:r>
-    </w:p>
-    <w:p>
-      <w:pPr>
-        <w:pStyle w:val="ListParagraph"/>
-        <w:numPr>
-          <w:ilvl w:val="0"/>
-          <w:numId w:val="12"/>
-        </w:numPr>
-        <w:rPr>
-          <w:lang w:val="en-US"/>
-        </w:rPr>
-      </w:pPr>
-      <w:r>
-        <w:rPr>
+          <w:rFonts w:ascii="Times New Roman" w:hAnsi="Times New Roman" w:cs="Times New Roman"/>
+          <w:lang w:val="en-US"/>
+        </w:rPr>
+      </w:pPr>
+      <w:r>
+        <w:rPr>
+          <w:rFonts w:ascii="Times New Roman" w:hAnsi="Times New Roman" w:cs="Times New Roman"/>
           <w:b/>
           <w:bCs/>
           <w:lang w:val="en-US"/>
@@ -2042,9 +2195,17 @@
       </w:r>
       <w:r>
         <w:rPr>
-          <w:lang w:val="en-US"/>
-        </w:rPr>
-        <w:t xml:space="preserve"> A member that belongs to the class itself rather than to any specific object.</w:t>
+          <w:rFonts w:ascii="Times New Roman" w:hAnsi="Times New Roman" w:cs="Times New Roman"/>
+          <w:lang w:val="en-US"/>
+        </w:rPr>
+        <w:t xml:space="preserve"> </w:t>
+      </w:r>
+      <w:r>
+        <w:rPr>
+          <w:rFonts w:ascii="Times New Roman" w:hAnsi="Times New Roman" w:cs="Times New Roman"/>
+          <w:lang w:val="en-US"/>
+        </w:rPr>
+        <w:t>The member is owned by the class, not the objects of the class.</w:t>
       </w:r>
     </w:p>
     <w:sectPr>

</xml_diff>